<commit_message>
Finished chapters 5 & 6 and started the main menu
</commit_message>
<xml_diff>
--- a/Attributions.docx
+++ b/Attributions.docx
@@ -11,30 +11,30 @@
           <w:highlight w:val="none"/>
         </w:rPr>
       </w:pPr>
-      <w:r/>
       <w:r>
         <w:t xml:space="preserve">Beagle_Bark_Interior_Hard_Walls 08.wav by n_audioman -- https://freesound.org/s/325481/ -- License: Attribution 4.0</w:t>
       </w:r>
+      <w:r>
+        <w:rPr>
+          <w:highlight w:val="none"/>
+        </w:rPr>
+      </w:r>
       <w:r/>
       <w:r/>
+      <w:r>
+        <w:rPr>
+          <w:highlight w:val="none"/>
+        </w:rPr>
+      </w:r>
     </w:p>
     <w:p>
       <w:pPr>
         <w:pBdr/>
         <w:spacing/>
         <w:ind/>
-        <w:rPr/>
-      </w:pPr>
-      <w:r/>
-      <w:r/>
-      <w:r/>
-    </w:p>
-    <w:p>
-      <w:pPr>
-        <w:pBdr/>
-        <w:spacing/>
-        <w:ind/>
-        <w:rPr/>
+        <w:rPr>
+          <w:highlight w:val="none"/>
+        </w:rPr>
       </w:pPr>
       <w:r>
         <w:rPr>
@@ -51,6 +51,30 @@
         <w:rPr>
           <w:highlight w:val="none"/>
         </w:rPr>
+      </w:r>
+      <w:r/>
+      <w:r/>
+      <w:r/>
+      <w:r/>
+      <w:r>
+        <w:rPr>
+          <w:highlight w:val="none"/>
+        </w:rPr>
+      </w:r>
+    </w:p>
+    <w:p>
+      <w:pPr>
+        <w:pBdr/>
+        <w:spacing/>
+        <w:ind/>
+        <w:rPr/>
+      </w:pPr>
+      <w:r>
+        <w:rPr>
+          <w:highlight w:val="none"/>
+          <w:lang w:val="es-ES"/>
+        </w:rPr>
+        <w:t xml:space="preserve">Prosymbols Premuim</w:t>
       </w:r>
       <w:r>
         <w:rPr>
@@ -85,7 +109,6 @@
         <w:ind/>
         <w:rPr/>
       </w:pPr>
-      <w:r/>
       <w:r>
         <w:separator/>
       </w:r>
@@ -100,7 +123,6 @@
         <w:ind/>
         <w:rPr/>
       </w:pPr>
-      <w:r/>
       <w:r>
         <w:continuationSeparator/>
       </w:r>
@@ -120,7 +142,6 @@
         <w:ind/>
         <w:rPr/>
       </w:pPr>
-      <w:r/>
       <w:r>
         <w:separator/>
       </w:r>
@@ -135,7 +156,6 @@
         <w:ind/>
         <w:rPr/>
       </w:pPr>
-      <w:r/>
       <w:r>
         <w:continuationSeparator/>
       </w:r>
@@ -303,9 +323,9 @@
     <w:lsdException w:name="Bibliography" w:uiPriority="37"/>
     <w:lsdException w:name="TOC Heading" w:uiPriority="39" w:qFormat="1"/>
   </w:latentStyles>
-  <w:style w:type="table" w:styleId="12">
+  <w:style w:type="table" w:styleId="701">
     <w:name w:val="Table Grid"/>
-    <w:basedOn w:val="665"/>
+    <w:basedOn w:val="887"/>
     <w:uiPriority w:val="59"/>
     <w:pPr>
       <w:pBdr/>
@@ -502,9 +522,9 @@
       </w:tcPr>
     </w:tblStylePr>
   </w:style>
-  <w:style w:type="table" w:styleId="13">
+  <w:style w:type="table" w:styleId="702">
     <w:name w:val="Table Grid Light"/>
-    <w:basedOn w:val="665"/>
+    <w:basedOn w:val="887"/>
     <w:uiPriority w:val="59"/>
     <w:pPr>
       <w:pBdr/>
@@ -701,9 +721,9 @@
       </w:tcPr>
     </w:tblStylePr>
   </w:style>
-  <w:style w:type="table" w:styleId="14">
+  <w:style w:type="table" w:styleId="703">
     <w:name w:val="Plain Table 1"/>
-    <w:basedOn w:val="665"/>
+    <w:basedOn w:val="887"/>
     <w:uiPriority w:val="59"/>
     <w:pPr>
       <w:pBdr/>
@@ -926,9 +946,9 @@
       </w:tcPr>
     </w:tblStylePr>
   </w:style>
-  <w:style w:type="table" w:styleId="15">
+  <w:style w:type="table" w:styleId="704">
     <w:name w:val="Plain Table 2"/>
-    <w:basedOn w:val="665"/>
+    <w:basedOn w:val="887"/>
     <w:uiPriority w:val="59"/>
     <w:pPr>
       <w:pBdr/>
@@ -1159,9 +1179,9 @@
       </w:tcPr>
     </w:tblStylePr>
   </w:style>
-  <w:style w:type="table" w:styleId="16">
+  <w:style w:type="table" w:styleId="705">
     <w:name w:val="Plain Table 3"/>
-    <w:basedOn w:val="665"/>
+    <w:basedOn w:val="887"/>
     <w:uiPriority w:val="99"/>
     <w:pPr>
       <w:pBdr/>
@@ -1389,9 +1409,9 @@
       </w:tcPr>
     </w:tblStylePr>
   </w:style>
-  <w:style w:type="table" w:styleId="17">
+  <w:style w:type="table" w:styleId="706">
     <w:name w:val="Plain Table 4"/>
-    <w:basedOn w:val="665"/>
+    <w:basedOn w:val="887"/>
     <w:uiPriority w:val="99"/>
     <w:pPr>
       <w:pBdr/>
@@ -1605,9 +1625,9 @@
       </w:tcPr>
     </w:tblStylePr>
   </w:style>
-  <w:style w:type="table" w:styleId="18">
+  <w:style w:type="table" w:styleId="707">
     <w:name w:val="Plain Table 5"/>
-    <w:basedOn w:val="665"/>
+    <w:basedOn w:val="887"/>
     <w:uiPriority w:val="99"/>
     <w:pPr>
       <w:pBdr/>
@@ -1838,9 +1858,9 @@
       </w:tcPr>
     </w:tblStylePr>
   </w:style>
-  <w:style w:type="table" w:styleId="19">
+  <w:style w:type="table" w:styleId="708">
     <w:name w:val="Grid Table 1 Light"/>
-    <w:basedOn w:val="665"/>
+    <w:basedOn w:val="887"/>
     <w:uiPriority w:val="99"/>
     <w:pPr>
       <w:pBdr/>
@@ -2061,9 +2081,9 @@
       </w:tcPr>
     </w:tblStylePr>
   </w:style>
-  <w:style w:type="table" w:styleId="20">
+  <w:style w:type="table" w:styleId="709">
     <w:name w:val="Grid Table 1 Light - Accent 1"/>
-    <w:basedOn w:val="665"/>
+    <w:basedOn w:val="887"/>
     <w:uiPriority w:val="99"/>
     <w:pPr>
       <w:pBdr/>
@@ -2284,9 +2304,9 @@
       </w:tcPr>
     </w:tblStylePr>
   </w:style>
-  <w:style w:type="table" w:styleId="21">
+  <w:style w:type="table" w:styleId="710">
     <w:name w:val="Grid Table 1 Light - Accent 2"/>
-    <w:basedOn w:val="665"/>
+    <w:basedOn w:val="887"/>
     <w:uiPriority w:val="99"/>
     <w:pPr>
       <w:pBdr/>
@@ -2507,9 +2527,9 @@
       </w:tcPr>
     </w:tblStylePr>
   </w:style>
-  <w:style w:type="table" w:styleId="22">
+  <w:style w:type="table" w:styleId="711">
     <w:name w:val="Grid Table 1 Light - Accent 3"/>
-    <w:basedOn w:val="665"/>
+    <w:basedOn w:val="887"/>
     <w:uiPriority w:val="99"/>
     <w:pPr>
       <w:pBdr/>
@@ -2730,9 +2750,9 @@
       </w:tcPr>
     </w:tblStylePr>
   </w:style>
-  <w:style w:type="table" w:styleId="23">
+  <w:style w:type="table" w:styleId="712">
     <w:name w:val="Grid Table 1 Light - Accent 4"/>
-    <w:basedOn w:val="665"/>
+    <w:basedOn w:val="887"/>
     <w:uiPriority w:val="99"/>
     <w:pPr>
       <w:pBdr/>
@@ -2953,9 +2973,9 @@
       </w:tcPr>
     </w:tblStylePr>
   </w:style>
-  <w:style w:type="table" w:styleId="24">
+  <w:style w:type="table" w:styleId="713">
     <w:name w:val="Grid Table 1 Light - Accent 5"/>
-    <w:basedOn w:val="665"/>
+    <w:basedOn w:val="887"/>
     <w:uiPriority w:val="99"/>
     <w:pPr>
       <w:pBdr/>
@@ -3176,9 +3196,9 @@
       </w:tcPr>
     </w:tblStylePr>
   </w:style>
-  <w:style w:type="table" w:styleId="25">
+  <w:style w:type="table" w:styleId="714">
     <w:name w:val="Grid Table 1 Light - Accent 6"/>
-    <w:basedOn w:val="665"/>
+    <w:basedOn w:val="887"/>
     <w:uiPriority w:val="99"/>
     <w:pPr>
       <w:pBdr/>
@@ -3399,9 +3419,9 @@
       </w:tcPr>
     </w:tblStylePr>
   </w:style>
-  <w:style w:type="table" w:styleId="26">
+  <w:style w:type="table" w:styleId="715">
     <w:name w:val="Grid Table 2"/>
-    <w:basedOn w:val="665"/>
+    <w:basedOn w:val="887"/>
     <w:uiPriority w:val="99"/>
     <w:pPr>
       <w:pBdr/>
@@ -3631,9 +3651,9 @@
       </w:tcPr>
     </w:tblStylePr>
   </w:style>
-  <w:style w:type="table" w:styleId="27">
+  <w:style w:type="table" w:styleId="716">
     <w:name w:val="Grid Table 2 - Accent 1"/>
-    <w:basedOn w:val="665"/>
+    <w:basedOn w:val="887"/>
     <w:uiPriority w:val="99"/>
     <w:pPr>
       <w:pBdr/>
@@ -3863,9 +3883,9 @@
       </w:tcPr>
     </w:tblStylePr>
   </w:style>
-  <w:style w:type="table" w:styleId="28">
+  <w:style w:type="table" w:styleId="717">
     <w:name w:val="Grid Table 2 - Accent 2"/>
-    <w:basedOn w:val="665"/>
+    <w:basedOn w:val="887"/>
     <w:uiPriority w:val="99"/>
     <w:pPr>
       <w:pBdr/>
@@ -4095,9 +4115,9 @@
       </w:tcPr>
     </w:tblStylePr>
   </w:style>
-  <w:style w:type="table" w:styleId="29">
+  <w:style w:type="table" w:styleId="718">
     <w:name w:val="Grid Table 2 - Accent 3"/>
-    <w:basedOn w:val="665"/>
+    <w:basedOn w:val="887"/>
     <w:uiPriority w:val="99"/>
     <w:pPr>
       <w:pBdr/>
@@ -4327,9 +4347,9 @@
       </w:tcPr>
     </w:tblStylePr>
   </w:style>
-  <w:style w:type="table" w:styleId="30">
+  <w:style w:type="table" w:styleId="719">
     <w:name w:val="Grid Table 2 - Accent 4"/>
-    <w:basedOn w:val="665"/>
+    <w:basedOn w:val="887"/>
     <w:uiPriority w:val="99"/>
     <w:pPr>
       <w:pBdr/>
@@ -4559,9 +4579,9 @@
       </w:tcPr>
     </w:tblStylePr>
   </w:style>
-  <w:style w:type="table" w:styleId="31">
+  <w:style w:type="table" w:styleId="720">
     <w:name w:val="Grid Table 2 - Accent 5"/>
-    <w:basedOn w:val="665"/>
+    <w:basedOn w:val="887"/>
     <w:uiPriority w:val="99"/>
     <w:pPr>
       <w:pBdr/>
@@ -4791,9 +4811,9 @@
       </w:tcPr>
     </w:tblStylePr>
   </w:style>
-  <w:style w:type="table" w:styleId="32">
+  <w:style w:type="table" w:styleId="721">
     <w:name w:val="Grid Table 2 - Accent 6"/>
-    <w:basedOn w:val="665"/>
+    <w:basedOn w:val="887"/>
     <w:uiPriority w:val="99"/>
     <w:pPr>
       <w:pBdr/>
@@ -5023,9 +5043,9 @@
       </w:tcPr>
     </w:tblStylePr>
   </w:style>
-  <w:style w:type="table" w:styleId="33">
+  <w:style w:type="table" w:styleId="722">
     <w:name w:val="Grid Table 3"/>
-    <w:basedOn w:val="665"/>
+    <w:basedOn w:val="887"/>
     <w:uiPriority w:val="99"/>
     <w:pPr>
       <w:pBdr/>
@@ -5124,29 +5144,6 @@
         <w:tblBorders/>
       </w:tblPr>
       <w:tcPr>
-        <w:shd w:color="ffffff"/>
-        <w:tcBorders>
-          <w:top w:val="none" w:color="000000" w:sz="4" w:space="0"/>
-          <w:left w:val="none" w:color="000000" w:sz="4" w:space="0"/>
-          <w:bottom w:val="none" w:color="000000" w:sz="4" w:space="0"/>
-          <w:right w:val="none" w:color="000000" w:sz="4" w:space="0"/>
-        </w:tcBorders>
-      </w:tcPr>
-    </w:tblStylePr>
-    <w:tblStylePr w:type="firstRow">
-      <w:rPr>
-        <w:b/>
-        <w:color w:val="404040"/>
-      </w:rPr>
-      <w:pPr>
-        <w:pBdr/>
-        <w:spacing/>
-        <w:ind/>
-      </w:pPr>
-      <w:tblPr>
-        <w:tblBorders/>
-      </w:tblPr>
-      <w:tcPr>
         <w:shd w:val="clear" w:color="ffffff"/>
         <w:tcBorders>
           <w:top w:val="none" w:color="000000" w:sz="4" w:space="0"/>
@@ -5156,30 +5153,7 @@
         </w:tcBorders>
       </w:tcPr>
     </w:tblStylePr>
-    <w:tblStylePr w:type="lastCol">
-      <w:rPr>
-        <w:i/>
-        <w:color w:val="404040"/>
-      </w:rPr>
-      <w:pPr>
-        <w:pBdr/>
-        <w:spacing/>
-        <w:ind/>
-      </w:pPr>
-      <w:tblPr>
-        <w:tblBorders/>
-      </w:tblPr>
-      <w:tcPr>
-        <w:shd w:color="ffffff"/>
-        <w:tcBorders>
-          <w:top w:val="none" w:color="000000" w:sz="4" w:space="0"/>
-          <w:left w:val="none" w:color="000000" w:sz="4" w:space="0"/>
-          <w:bottom w:val="none" w:color="000000" w:sz="4" w:space="0"/>
-          <w:right w:val="none" w:color="000000" w:sz="4" w:space="0"/>
-        </w:tcBorders>
-      </w:tcPr>
-    </w:tblStylePr>
-    <w:tblStylePr w:type="lastRow">
+    <w:tblStylePr w:type="firstRow">
       <w:rPr>
         <w:b/>
         <w:color w:val="404040"/>
@@ -5202,6 +5176,52 @@
         </w:tcBorders>
       </w:tcPr>
     </w:tblStylePr>
+    <w:tblStylePr w:type="lastCol">
+      <w:rPr>
+        <w:i/>
+        <w:color w:val="404040"/>
+      </w:rPr>
+      <w:pPr>
+        <w:pBdr/>
+        <w:spacing/>
+        <w:ind/>
+      </w:pPr>
+      <w:tblPr>
+        <w:tblBorders/>
+      </w:tblPr>
+      <w:tcPr>
+        <w:shd w:val="clear" w:color="ffffff"/>
+        <w:tcBorders>
+          <w:top w:val="none" w:color="000000" w:sz="4" w:space="0"/>
+          <w:left w:val="none" w:color="000000" w:sz="4" w:space="0"/>
+          <w:bottom w:val="none" w:color="000000" w:sz="4" w:space="0"/>
+          <w:right w:val="none" w:color="000000" w:sz="4" w:space="0"/>
+        </w:tcBorders>
+      </w:tcPr>
+    </w:tblStylePr>
+    <w:tblStylePr w:type="lastRow">
+      <w:rPr>
+        <w:b/>
+        <w:color w:val="404040"/>
+      </w:rPr>
+      <w:pPr>
+        <w:pBdr/>
+        <w:spacing/>
+        <w:ind/>
+      </w:pPr>
+      <w:tblPr>
+        <w:tblBorders/>
+      </w:tblPr>
+      <w:tcPr>
+        <w:shd w:val="clear" w:color="ffffff"/>
+        <w:tcBorders>
+          <w:top w:val="none" w:color="000000" w:sz="4" w:space="0"/>
+          <w:left w:val="none" w:color="000000" w:sz="4" w:space="0"/>
+          <w:bottom w:val="none" w:color="000000" w:sz="4" w:space="0"/>
+          <w:right w:val="none" w:color="000000" w:sz="4" w:space="0"/>
+        </w:tcBorders>
+      </w:tcPr>
+    </w:tblStylePr>
     <w:tblStylePr w:type="nwCell">
       <w:pPr>
         <w:pBdr/>
@@ -5268,9 +5288,9 @@
       </w:tcPr>
     </w:tblStylePr>
   </w:style>
-  <w:style w:type="table" w:styleId="34">
+  <w:style w:type="table" w:styleId="723">
     <w:name w:val="Grid Table 3 - Accent 1"/>
-    <w:basedOn w:val="665"/>
+    <w:basedOn w:val="887"/>
     <w:uiPriority w:val="99"/>
     <w:pPr>
       <w:pBdr/>
@@ -5369,29 +5389,6 @@
         <w:tblBorders/>
       </w:tblPr>
       <w:tcPr>
-        <w:shd w:color="ffffff"/>
-        <w:tcBorders>
-          <w:top w:val="none" w:color="000000" w:sz="4" w:space="0"/>
-          <w:left w:val="none" w:color="000000" w:sz="4" w:space="0"/>
-          <w:bottom w:val="none" w:color="000000" w:sz="4" w:space="0"/>
-          <w:right w:val="none" w:color="000000" w:sz="4" w:space="0"/>
-        </w:tcBorders>
-      </w:tcPr>
-    </w:tblStylePr>
-    <w:tblStylePr w:type="firstRow">
-      <w:rPr>
-        <w:b/>
-        <w:color w:val="404040"/>
-      </w:rPr>
-      <w:pPr>
-        <w:pBdr/>
-        <w:spacing/>
-        <w:ind/>
-      </w:pPr>
-      <w:tblPr>
-        <w:tblBorders/>
-      </w:tblPr>
-      <w:tcPr>
         <w:shd w:val="clear" w:color="ffffff"/>
         <w:tcBorders>
           <w:top w:val="none" w:color="000000" w:sz="4" w:space="0"/>
@@ -5401,30 +5398,7 @@
         </w:tcBorders>
       </w:tcPr>
     </w:tblStylePr>
-    <w:tblStylePr w:type="lastCol">
-      <w:rPr>
-        <w:i/>
-        <w:color w:val="404040"/>
-      </w:rPr>
-      <w:pPr>
-        <w:pBdr/>
-        <w:spacing/>
-        <w:ind/>
-      </w:pPr>
-      <w:tblPr>
-        <w:tblBorders/>
-      </w:tblPr>
-      <w:tcPr>
-        <w:shd w:color="ffffff"/>
-        <w:tcBorders>
-          <w:top w:val="none" w:color="000000" w:sz="4" w:space="0"/>
-          <w:left w:val="none" w:color="000000" w:sz="4" w:space="0"/>
-          <w:bottom w:val="none" w:color="000000" w:sz="4" w:space="0"/>
-          <w:right w:val="none" w:color="000000" w:sz="4" w:space="0"/>
-        </w:tcBorders>
-      </w:tcPr>
-    </w:tblStylePr>
-    <w:tblStylePr w:type="lastRow">
+    <w:tblStylePr w:type="firstRow">
       <w:rPr>
         <w:b/>
         <w:color w:val="404040"/>
@@ -5447,6 +5421,52 @@
         </w:tcBorders>
       </w:tcPr>
     </w:tblStylePr>
+    <w:tblStylePr w:type="lastCol">
+      <w:rPr>
+        <w:i/>
+        <w:color w:val="404040"/>
+      </w:rPr>
+      <w:pPr>
+        <w:pBdr/>
+        <w:spacing/>
+        <w:ind/>
+      </w:pPr>
+      <w:tblPr>
+        <w:tblBorders/>
+      </w:tblPr>
+      <w:tcPr>
+        <w:shd w:val="clear" w:color="ffffff"/>
+        <w:tcBorders>
+          <w:top w:val="none" w:color="000000" w:sz="4" w:space="0"/>
+          <w:left w:val="none" w:color="000000" w:sz="4" w:space="0"/>
+          <w:bottom w:val="none" w:color="000000" w:sz="4" w:space="0"/>
+          <w:right w:val="none" w:color="000000" w:sz="4" w:space="0"/>
+        </w:tcBorders>
+      </w:tcPr>
+    </w:tblStylePr>
+    <w:tblStylePr w:type="lastRow">
+      <w:rPr>
+        <w:b/>
+        <w:color w:val="404040"/>
+      </w:rPr>
+      <w:pPr>
+        <w:pBdr/>
+        <w:spacing/>
+        <w:ind/>
+      </w:pPr>
+      <w:tblPr>
+        <w:tblBorders/>
+      </w:tblPr>
+      <w:tcPr>
+        <w:shd w:val="clear" w:color="ffffff"/>
+        <w:tcBorders>
+          <w:top w:val="none" w:color="000000" w:sz="4" w:space="0"/>
+          <w:left w:val="none" w:color="000000" w:sz="4" w:space="0"/>
+          <w:bottom w:val="none" w:color="000000" w:sz="4" w:space="0"/>
+          <w:right w:val="none" w:color="000000" w:sz="4" w:space="0"/>
+        </w:tcBorders>
+      </w:tcPr>
+    </w:tblStylePr>
     <w:tblStylePr w:type="nwCell">
       <w:pPr>
         <w:pBdr/>
@@ -5513,9 +5533,9 @@
       </w:tcPr>
     </w:tblStylePr>
   </w:style>
-  <w:style w:type="table" w:styleId="35">
+  <w:style w:type="table" w:styleId="724">
     <w:name w:val="Grid Table 3 - Accent 2"/>
-    <w:basedOn w:val="665"/>
+    <w:basedOn w:val="887"/>
     <w:uiPriority w:val="99"/>
     <w:pPr>
       <w:pBdr/>
@@ -5614,29 +5634,6 @@
         <w:tblBorders/>
       </w:tblPr>
       <w:tcPr>
-        <w:shd w:color="ffffff"/>
-        <w:tcBorders>
-          <w:top w:val="none" w:color="000000" w:sz="4" w:space="0"/>
-          <w:left w:val="none" w:color="000000" w:sz="4" w:space="0"/>
-          <w:bottom w:val="none" w:color="000000" w:sz="4" w:space="0"/>
-          <w:right w:val="none" w:color="000000" w:sz="4" w:space="0"/>
-        </w:tcBorders>
-      </w:tcPr>
-    </w:tblStylePr>
-    <w:tblStylePr w:type="firstRow">
-      <w:rPr>
-        <w:b/>
-        <w:color w:val="404040"/>
-      </w:rPr>
-      <w:pPr>
-        <w:pBdr/>
-        <w:spacing/>
-        <w:ind/>
-      </w:pPr>
-      <w:tblPr>
-        <w:tblBorders/>
-      </w:tblPr>
-      <w:tcPr>
         <w:shd w:val="clear" w:color="ffffff"/>
         <w:tcBorders>
           <w:top w:val="none" w:color="000000" w:sz="4" w:space="0"/>
@@ -5646,30 +5643,7 @@
         </w:tcBorders>
       </w:tcPr>
     </w:tblStylePr>
-    <w:tblStylePr w:type="lastCol">
-      <w:rPr>
-        <w:i/>
-        <w:color w:val="404040"/>
-      </w:rPr>
-      <w:pPr>
-        <w:pBdr/>
-        <w:spacing/>
-        <w:ind/>
-      </w:pPr>
-      <w:tblPr>
-        <w:tblBorders/>
-      </w:tblPr>
-      <w:tcPr>
-        <w:shd w:color="ffffff"/>
-        <w:tcBorders>
-          <w:top w:val="none" w:color="000000" w:sz="4" w:space="0"/>
-          <w:left w:val="none" w:color="000000" w:sz="4" w:space="0"/>
-          <w:bottom w:val="none" w:color="000000" w:sz="4" w:space="0"/>
-          <w:right w:val="none" w:color="000000" w:sz="4" w:space="0"/>
-        </w:tcBorders>
-      </w:tcPr>
-    </w:tblStylePr>
-    <w:tblStylePr w:type="lastRow">
+    <w:tblStylePr w:type="firstRow">
       <w:rPr>
         <w:b/>
         <w:color w:val="404040"/>
@@ -5692,6 +5666,52 @@
         </w:tcBorders>
       </w:tcPr>
     </w:tblStylePr>
+    <w:tblStylePr w:type="lastCol">
+      <w:rPr>
+        <w:i/>
+        <w:color w:val="404040"/>
+      </w:rPr>
+      <w:pPr>
+        <w:pBdr/>
+        <w:spacing/>
+        <w:ind/>
+      </w:pPr>
+      <w:tblPr>
+        <w:tblBorders/>
+      </w:tblPr>
+      <w:tcPr>
+        <w:shd w:val="clear" w:color="ffffff"/>
+        <w:tcBorders>
+          <w:top w:val="none" w:color="000000" w:sz="4" w:space="0"/>
+          <w:left w:val="none" w:color="000000" w:sz="4" w:space="0"/>
+          <w:bottom w:val="none" w:color="000000" w:sz="4" w:space="0"/>
+          <w:right w:val="none" w:color="000000" w:sz="4" w:space="0"/>
+        </w:tcBorders>
+      </w:tcPr>
+    </w:tblStylePr>
+    <w:tblStylePr w:type="lastRow">
+      <w:rPr>
+        <w:b/>
+        <w:color w:val="404040"/>
+      </w:rPr>
+      <w:pPr>
+        <w:pBdr/>
+        <w:spacing/>
+        <w:ind/>
+      </w:pPr>
+      <w:tblPr>
+        <w:tblBorders/>
+      </w:tblPr>
+      <w:tcPr>
+        <w:shd w:val="clear" w:color="ffffff"/>
+        <w:tcBorders>
+          <w:top w:val="none" w:color="000000" w:sz="4" w:space="0"/>
+          <w:left w:val="none" w:color="000000" w:sz="4" w:space="0"/>
+          <w:bottom w:val="none" w:color="000000" w:sz="4" w:space="0"/>
+          <w:right w:val="none" w:color="000000" w:sz="4" w:space="0"/>
+        </w:tcBorders>
+      </w:tcPr>
+    </w:tblStylePr>
     <w:tblStylePr w:type="nwCell">
       <w:pPr>
         <w:pBdr/>
@@ -5758,9 +5778,9 @@
       </w:tcPr>
     </w:tblStylePr>
   </w:style>
-  <w:style w:type="table" w:styleId="36">
+  <w:style w:type="table" w:styleId="725">
     <w:name w:val="Grid Table 3 - Accent 3"/>
-    <w:basedOn w:val="665"/>
+    <w:basedOn w:val="887"/>
     <w:uiPriority w:val="99"/>
     <w:pPr>
       <w:pBdr/>
@@ -5859,29 +5879,6 @@
         <w:tblBorders/>
       </w:tblPr>
       <w:tcPr>
-        <w:shd w:color="ffffff"/>
-        <w:tcBorders>
-          <w:top w:val="none" w:color="000000" w:sz="4" w:space="0"/>
-          <w:left w:val="none" w:color="000000" w:sz="4" w:space="0"/>
-          <w:bottom w:val="none" w:color="000000" w:sz="4" w:space="0"/>
-          <w:right w:val="none" w:color="000000" w:sz="4" w:space="0"/>
-        </w:tcBorders>
-      </w:tcPr>
-    </w:tblStylePr>
-    <w:tblStylePr w:type="firstRow">
-      <w:rPr>
-        <w:b/>
-        <w:color w:val="404040"/>
-      </w:rPr>
-      <w:pPr>
-        <w:pBdr/>
-        <w:spacing/>
-        <w:ind/>
-      </w:pPr>
-      <w:tblPr>
-        <w:tblBorders/>
-      </w:tblPr>
-      <w:tcPr>
         <w:shd w:val="clear" w:color="ffffff"/>
         <w:tcBorders>
           <w:top w:val="none" w:color="000000" w:sz="4" w:space="0"/>
@@ -5891,30 +5888,7 @@
         </w:tcBorders>
       </w:tcPr>
     </w:tblStylePr>
-    <w:tblStylePr w:type="lastCol">
-      <w:rPr>
-        <w:i/>
-        <w:color w:val="404040"/>
-      </w:rPr>
-      <w:pPr>
-        <w:pBdr/>
-        <w:spacing/>
-        <w:ind/>
-      </w:pPr>
-      <w:tblPr>
-        <w:tblBorders/>
-      </w:tblPr>
-      <w:tcPr>
-        <w:shd w:color="ffffff"/>
-        <w:tcBorders>
-          <w:top w:val="none" w:color="000000" w:sz="4" w:space="0"/>
-          <w:left w:val="none" w:color="000000" w:sz="4" w:space="0"/>
-          <w:bottom w:val="none" w:color="000000" w:sz="4" w:space="0"/>
-          <w:right w:val="none" w:color="000000" w:sz="4" w:space="0"/>
-        </w:tcBorders>
-      </w:tcPr>
-    </w:tblStylePr>
-    <w:tblStylePr w:type="lastRow">
+    <w:tblStylePr w:type="firstRow">
       <w:rPr>
         <w:b/>
         <w:color w:val="404040"/>
@@ -5937,6 +5911,52 @@
         </w:tcBorders>
       </w:tcPr>
     </w:tblStylePr>
+    <w:tblStylePr w:type="lastCol">
+      <w:rPr>
+        <w:i/>
+        <w:color w:val="404040"/>
+      </w:rPr>
+      <w:pPr>
+        <w:pBdr/>
+        <w:spacing/>
+        <w:ind/>
+      </w:pPr>
+      <w:tblPr>
+        <w:tblBorders/>
+      </w:tblPr>
+      <w:tcPr>
+        <w:shd w:val="clear" w:color="ffffff"/>
+        <w:tcBorders>
+          <w:top w:val="none" w:color="000000" w:sz="4" w:space="0"/>
+          <w:left w:val="none" w:color="000000" w:sz="4" w:space="0"/>
+          <w:bottom w:val="none" w:color="000000" w:sz="4" w:space="0"/>
+          <w:right w:val="none" w:color="000000" w:sz="4" w:space="0"/>
+        </w:tcBorders>
+      </w:tcPr>
+    </w:tblStylePr>
+    <w:tblStylePr w:type="lastRow">
+      <w:rPr>
+        <w:b/>
+        <w:color w:val="404040"/>
+      </w:rPr>
+      <w:pPr>
+        <w:pBdr/>
+        <w:spacing/>
+        <w:ind/>
+      </w:pPr>
+      <w:tblPr>
+        <w:tblBorders/>
+      </w:tblPr>
+      <w:tcPr>
+        <w:shd w:val="clear" w:color="ffffff"/>
+        <w:tcBorders>
+          <w:top w:val="none" w:color="000000" w:sz="4" w:space="0"/>
+          <w:left w:val="none" w:color="000000" w:sz="4" w:space="0"/>
+          <w:bottom w:val="none" w:color="000000" w:sz="4" w:space="0"/>
+          <w:right w:val="none" w:color="000000" w:sz="4" w:space="0"/>
+        </w:tcBorders>
+      </w:tcPr>
+    </w:tblStylePr>
     <w:tblStylePr w:type="nwCell">
       <w:pPr>
         <w:pBdr/>
@@ -6003,9 +6023,9 @@
       </w:tcPr>
     </w:tblStylePr>
   </w:style>
-  <w:style w:type="table" w:styleId="37">
+  <w:style w:type="table" w:styleId="726">
     <w:name w:val="Grid Table 3 - Accent 4"/>
-    <w:basedOn w:val="665"/>
+    <w:basedOn w:val="887"/>
     <w:uiPriority w:val="99"/>
     <w:pPr>
       <w:pBdr/>
@@ -6104,29 +6124,6 @@
         <w:tblBorders/>
       </w:tblPr>
       <w:tcPr>
-        <w:shd w:color="ffffff"/>
-        <w:tcBorders>
-          <w:top w:val="none" w:color="000000" w:sz="4" w:space="0"/>
-          <w:left w:val="none" w:color="000000" w:sz="4" w:space="0"/>
-          <w:bottom w:val="none" w:color="000000" w:sz="4" w:space="0"/>
-          <w:right w:val="none" w:color="000000" w:sz="4" w:space="0"/>
-        </w:tcBorders>
-      </w:tcPr>
-    </w:tblStylePr>
-    <w:tblStylePr w:type="firstRow">
-      <w:rPr>
-        <w:b/>
-        <w:color w:val="404040"/>
-      </w:rPr>
-      <w:pPr>
-        <w:pBdr/>
-        <w:spacing/>
-        <w:ind/>
-      </w:pPr>
-      <w:tblPr>
-        <w:tblBorders/>
-      </w:tblPr>
-      <w:tcPr>
         <w:shd w:val="clear" w:color="ffffff"/>
         <w:tcBorders>
           <w:top w:val="none" w:color="000000" w:sz="4" w:space="0"/>
@@ -6136,30 +6133,7 @@
         </w:tcBorders>
       </w:tcPr>
     </w:tblStylePr>
-    <w:tblStylePr w:type="lastCol">
-      <w:rPr>
-        <w:i/>
-        <w:color w:val="404040"/>
-      </w:rPr>
-      <w:pPr>
-        <w:pBdr/>
-        <w:spacing/>
-        <w:ind/>
-      </w:pPr>
-      <w:tblPr>
-        <w:tblBorders/>
-      </w:tblPr>
-      <w:tcPr>
-        <w:shd w:color="ffffff"/>
-        <w:tcBorders>
-          <w:top w:val="none" w:color="000000" w:sz="4" w:space="0"/>
-          <w:left w:val="none" w:color="000000" w:sz="4" w:space="0"/>
-          <w:bottom w:val="none" w:color="000000" w:sz="4" w:space="0"/>
-          <w:right w:val="none" w:color="000000" w:sz="4" w:space="0"/>
-        </w:tcBorders>
-      </w:tcPr>
-    </w:tblStylePr>
-    <w:tblStylePr w:type="lastRow">
+    <w:tblStylePr w:type="firstRow">
       <w:rPr>
         <w:b/>
         <w:color w:val="404040"/>
@@ -6182,6 +6156,52 @@
         </w:tcBorders>
       </w:tcPr>
     </w:tblStylePr>
+    <w:tblStylePr w:type="lastCol">
+      <w:rPr>
+        <w:i/>
+        <w:color w:val="404040"/>
+      </w:rPr>
+      <w:pPr>
+        <w:pBdr/>
+        <w:spacing/>
+        <w:ind/>
+      </w:pPr>
+      <w:tblPr>
+        <w:tblBorders/>
+      </w:tblPr>
+      <w:tcPr>
+        <w:shd w:val="clear" w:color="ffffff"/>
+        <w:tcBorders>
+          <w:top w:val="none" w:color="000000" w:sz="4" w:space="0"/>
+          <w:left w:val="none" w:color="000000" w:sz="4" w:space="0"/>
+          <w:bottom w:val="none" w:color="000000" w:sz="4" w:space="0"/>
+          <w:right w:val="none" w:color="000000" w:sz="4" w:space="0"/>
+        </w:tcBorders>
+      </w:tcPr>
+    </w:tblStylePr>
+    <w:tblStylePr w:type="lastRow">
+      <w:rPr>
+        <w:b/>
+        <w:color w:val="404040"/>
+      </w:rPr>
+      <w:pPr>
+        <w:pBdr/>
+        <w:spacing/>
+        <w:ind/>
+      </w:pPr>
+      <w:tblPr>
+        <w:tblBorders/>
+      </w:tblPr>
+      <w:tcPr>
+        <w:shd w:val="clear" w:color="ffffff"/>
+        <w:tcBorders>
+          <w:top w:val="none" w:color="000000" w:sz="4" w:space="0"/>
+          <w:left w:val="none" w:color="000000" w:sz="4" w:space="0"/>
+          <w:bottom w:val="none" w:color="000000" w:sz="4" w:space="0"/>
+          <w:right w:val="none" w:color="000000" w:sz="4" w:space="0"/>
+        </w:tcBorders>
+      </w:tcPr>
+    </w:tblStylePr>
     <w:tblStylePr w:type="nwCell">
       <w:pPr>
         <w:pBdr/>
@@ -6248,9 +6268,9 @@
       </w:tcPr>
     </w:tblStylePr>
   </w:style>
-  <w:style w:type="table" w:styleId="38">
+  <w:style w:type="table" w:styleId="727">
     <w:name w:val="Grid Table 3 - Accent 5"/>
-    <w:basedOn w:val="665"/>
+    <w:basedOn w:val="887"/>
     <w:uiPriority w:val="99"/>
     <w:pPr>
       <w:pBdr/>
@@ -6349,29 +6369,6 @@
         <w:tblBorders/>
       </w:tblPr>
       <w:tcPr>
-        <w:shd w:color="ffffff"/>
-        <w:tcBorders>
-          <w:top w:val="none" w:color="000000" w:sz="4" w:space="0"/>
-          <w:left w:val="none" w:color="000000" w:sz="4" w:space="0"/>
-          <w:bottom w:val="none" w:color="000000" w:sz="4" w:space="0"/>
-          <w:right w:val="none" w:color="000000" w:sz="4" w:space="0"/>
-        </w:tcBorders>
-      </w:tcPr>
-    </w:tblStylePr>
-    <w:tblStylePr w:type="firstRow">
-      <w:rPr>
-        <w:b/>
-        <w:color w:val="404040"/>
-      </w:rPr>
-      <w:pPr>
-        <w:pBdr/>
-        <w:spacing/>
-        <w:ind/>
-      </w:pPr>
-      <w:tblPr>
-        <w:tblBorders/>
-      </w:tblPr>
-      <w:tcPr>
         <w:shd w:val="clear" w:color="ffffff"/>
         <w:tcBorders>
           <w:top w:val="none" w:color="000000" w:sz="4" w:space="0"/>
@@ -6381,30 +6378,7 @@
         </w:tcBorders>
       </w:tcPr>
     </w:tblStylePr>
-    <w:tblStylePr w:type="lastCol">
-      <w:rPr>
-        <w:i/>
-        <w:color w:val="404040"/>
-      </w:rPr>
-      <w:pPr>
-        <w:pBdr/>
-        <w:spacing/>
-        <w:ind/>
-      </w:pPr>
-      <w:tblPr>
-        <w:tblBorders/>
-      </w:tblPr>
-      <w:tcPr>
-        <w:shd w:color="ffffff"/>
-        <w:tcBorders>
-          <w:top w:val="none" w:color="000000" w:sz="4" w:space="0"/>
-          <w:left w:val="none" w:color="000000" w:sz="4" w:space="0"/>
-          <w:bottom w:val="none" w:color="000000" w:sz="4" w:space="0"/>
-          <w:right w:val="none" w:color="000000" w:sz="4" w:space="0"/>
-        </w:tcBorders>
-      </w:tcPr>
-    </w:tblStylePr>
-    <w:tblStylePr w:type="lastRow">
+    <w:tblStylePr w:type="firstRow">
       <w:rPr>
         <w:b/>
         <w:color w:val="404040"/>
@@ -6427,6 +6401,52 @@
         </w:tcBorders>
       </w:tcPr>
     </w:tblStylePr>
+    <w:tblStylePr w:type="lastCol">
+      <w:rPr>
+        <w:i/>
+        <w:color w:val="404040"/>
+      </w:rPr>
+      <w:pPr>
+        <w:pBdr/>
+        <w:spacing/>
+        <w:ind/>
+      </w:pPr>
+      <w:tblPr>
+        <w:tblBorders/>
+      </w:tblPr>
+      <w:tcPr>
+        <w:shd w:val="clear" w:color="ffffff"/>
+        <w:tcBorders>
+          <w:top w:val="none" w:color="000000" w:sz="4" w:space="0"/>
+          <w:left w:val="none" w:color="000000" w:sz="4" w:space="0"/>
+          <w:bottom w:val="none" w:color="000000" w:sz="4" w:space="0"/>
+          <w:right w:val="none" w:color="000000" w:sz="4" w:space="0"/>
+        </w:tcBorders>
+      </w:tcPr>
+    </w:tblStylePr>
+    <w:tblStylePr w:type="lastRow">
+      <w:rPr>
+        <w:b/>
+        <w:color w:val="404040"/>
+      </w:rPr>
+      <w:pPr>
+        <w:pBdr/>
+        <w:spacing/>
+        <w:ind/>
+      </w:pPr>
+      <w:tblPr>
+        <w:tblBorders/>
+      </w:tblPr>
+      <w:tcPr>
+        <w:shd w:val="clear" w:color="ffffff"/>
+        <w:tcBorders>
+          <w:top w:val="none" w:color="000000" w:sz="4" w:space="0"/>
+          <w:left w:val="none" w:color="000000" w:sz="4" w:space="0"/>
+          <w:bottom w:val="none" w:color="000000" w:sz="4" w:space="0"/>
+          <w:right w:val="none" w:color="000000" w:sz="4" w:space="0"/>
+        </w:tcBorders>
+      </w:tcPr>
+    </w:tblStylePr>
     <w:tblStylePr w:type="nwCell">
       <w:pPr>
         <w:pBdr/>
@@ -6493,9 +6513,9 @@
       </w:tcPr>
     </w:tblStylePr>
   </w:style>
-  <w:style w:type="table" w:styleId="39">
+  <w:style w:type="table" w:styleId="728">
     <w:name w:val="Grid Table 3 - Accent 6"/>
-    <w:basedOn w:val="665"/>
+    <w:basedOn w:val="887"/>
     <w:uiPriority w:val="99"/>
     <w:pPr>
       <w:pBdr/>
@@ -6594,29 +6614,6 @@
         <w:tblBorders/>
       </w:tblPr>
       <w:tcPr>
-        <w:shd w:color="ffffff"/>
-        <w:tcBorders>
-          <w:top w:val="none" w:color="000000" w:sz="4" w:space="0"/>
-          <w:left w:val="none" w:color="000000" w:sz="4" w:space="0"/>
-          <w:bottom w:val="none" w:color="000000" w:sz="4" w:space="0"/>
-          <w:right w:val="none" w:color="000000" w:sz="4" w:space="0"/>
-        </w:tcBorders>
-      </w:tcPr>
-    </w:tblStylePr>
-    <w:tblStylePr w:type="firstRow">
-      <w:rPr>
-        <w:b/>
-        <w:color w:val="404040"/>
-      </w:rPr>
-      <w:pPr>
-        <w:pBdr/>
-        <w:spacing/>
-        <w:ind/>
-      </w:pPr>
-      <w:tblPr>
-        <w:tblBorders/>
-      </w:tblPr>
-      <w:tcPr>
         <w:shd w:val="clear" w:color="ffffff"/>
         <w:tcBorders>
           <w:top w:val="none" w:color="000000" w:sz="4" w:space="0"/>
@@ -6626,30 +6623,7 @@
         </w:tcBorders>
       </w:tcPr>
     </w:tblStylePr>
-    <w:tblStylePr w:type="lastCol">
-      <w:rPr>
-        <w:i/>
-        <w:color w:val="404040"/>
-      </w:rPr>
-      <w:pPr>
-        <w:pBdr/>
-        <w:spacing/>
-        <w:ind/>
-      </w:pPr>
-      <w:tblPr>
-        <w:tblBorders/>
-      </w:tblPr>
-      <w:tcPr>
-        <w:shd w:color="ffffff"/>
-        <w:tcBorders>
-          <w:top w:val="none" w:color="000000" w:sz="4" w:space="0"/>
-          <w:left w:val="none" w:color="000000" w:sz="4" w:space="0"/>
-          <w:bottom w:val="none" w:color="000000" w:sz="4" w:space="0"/>
-          <w:right w:val="none" w:color="000000" w:sz="4" w:space="0"/>
-        </w:tcBorders>
-      </w:tcPr>
-    </w:tblStylePr>
-    <w:tblStylePr w:type="lastRow">
+    <w:tblStylePr w:type="firstRow">
       <w:rPr>
         <w:b/>
         <w:color w:val="404040"/>
@@ -6672,6 +6646,52 @@
         </w:tcBorders>
       </w:tcPr>
     </w:tblStylePr>
+    <w:tblStylePr w:type="lastCol">
+      <w:rPr>
+        <w:i/>
+        <w:color w:val="404040"/>
+      </w:rPr>
+      <w:pPr>
+        <w:pBdr/>
+        <w:spacing/>
+        <w:ind/>
+      </w:pPr>
+      <w:tblPr>
+        <w:tblBorders/>
+      </w:tblPr>
+      <w:tcPr>
+        <w:shd w:val="clear" w:color="ffffff"/>
+        <w:tcBorders>
+          <w:top w:val="none" w:color="000000" w:sz="4" w:space="0"/>
+          <w:left w:val="none" w:color="000000" w:sz="4" w:space="0"/>
+          <w:bottom w:val="none" w:color="000000" w:sz="4" w:space="0"/>
+          <w:right w:val="none" w:color="000000" w:sz="4" w:space="0"/>
+        </w:tcBorders>
+      </w:tcPr>
+    </w:tblStylePr>
+    <w:tblStylePr w:type="lastRow">
+      <w:rPr>
+        <w:b/>
+        <w:color w:val="404040"/>
+      </w:rPr>
+      <w:pPr>
+        <w:pBdr/>
+        <w:spacing/>
+        <w:ind/>
+      </w:pPr>
+      <w:tblPr>
+        <w:tblBorders/>
+      </w:tblPr>
+      <w:tcPr>
+        <w:shd w:val="clear" w:color="ffffff"/>
+        <w:tcBorders>
+          <w:top w:val="none" w:color="000000" w:sz="4" w:space="0"/>
+          <w:left w:val="none" w:color="000000" w:sz="4" w:space="0"/>
+          <w:bottom w:val="none" w:color="000000" w:sz="4" w:space="0"/>
+          <w:right w:val="none" w:color="000000" w:sz="4" w:space="0"/>
+        </w:tcBorders>
+      </w:tcPr>
+    </w:tblStylePr>
     <w:tblStylePr w:type="nwCell">
       <w:pPr>
         <w:pBdr/>
@@ -6738,9 +6758,9 @@
       </w:tcPr>
     </w:tblStylePr>
   </w:style>
-  <w:style w:type="table" w:styleId="40">
+  <w:style w:type="table" w:styleId="729">
     <w:name w:val="Grid Table 4"/>
-    <w:basedOn w:val="665"/>
+    <w:basedOn w:val="887"/>
     <w:uiPriority w:val="59"/>
     <w:pPr>
       <w:pBdr/>
@@ -6971,9 +6991,9 @@
       </w:tcPr>
     </w:tblStylePr>
   </w:style>
-  <w:style w:type="table" w:styleId="41">
+  <w:style w:type="table" w:styleId="730">
     <w:name w:val="Grid Table 4 - Accent 1"/>
-    <w:basedOn w:val="665"/>
+    <w:basedOn w:val="887"/>
     <w:uiPriority w:val="59"/>
     <w:pPr>
       <w:pBdr/>
@@ -7204,9 +7224,9 @@
       </w:tcPr>
     </w:tblStylePr>
   </w:style>
-  <w:style w:type="table" w:styleId="42">
+  <w:style w:type="table" w:styleId="731">
     <w:name w:val="Grid Table 4 - Accent 2"/>
-    <w:basedOn w:val="665"/>
+    <w:basedOn w:val="887"/>
     <w:uiPriority w:val="59"/>
     <w:pPr>
       <w:pBdr/>
@@ -7437,9 +7457,9 @@
       </w:tcPr>
     </w:tblStylePr>
   </w:style>
-  <w:style w:type="table" w:styleId="43">
+  <w:style w:type="table" w:styleId="732">
     <w:name w:val="Grid Table 4 - Accent 3"/>
-    <w:basedOn w:val="665"/>
+    <w:basedOn w:val="887"/>
     <w:uiPriority w:val="59"/>
     <w:pPr>
       <w:pBdr/>
@@ -7670,9 +7690,9 @@
       </w:tcPr>
     </w:tblStylePr>
   </w:style>
-  <w:style w:type="table" w:styleId="44">
+  <w:style w:type="table" w:styleId="733">
     <w:name w:val="Grid Table 4 - Accent 4"/>
-    <w:basedOn w:val="665"/>
+    <w:basedOn w:val="887"/>
     <w:uiPriority w:val="59"/>
     <w:pPr>
       <w:pBdr/>
@@ -7903,9 +7923,9 @@
       </w:tcPr>
     </w:tblStylePr>
   </w:style>
-  <w:style w:type="table" w:styleId="45">
+  <w:style w:type="table" w:styleId="734">
     <w:name w:val="Grid Table 4 - Accent 5"/>
-    <w:basedOn w:val="665"/>
+    <w:basedOn w:val="887"/>
     <w:uiPriority w:val="59"/>
     <w:pPr>
       <w:pBdr/>
@@ -8136,9 +8156,9 @@
       </w:tcPr>
     </w:tblStylePr>
   </w:style>
-  <w:style w:type="table" w:styleId="46">
+  <w:style w:type="table" w:styleId="735">
     <w:name w:val="Grid Table 4 - Accent 6"/>
-    <w:basedOn w:val="665"/>
+    <w:basedOn w:val="887"/>
     <w:uiPriority w:val="59"/>
     <w:pPr>
       <w:pBdr/>
@@ -8369,9 +8389,9 @@
       </w:tcPr>
     </w:tblStylePr>
   </w:style>
-  <w:style w:type="table" w:styleId="47">
+  <w:style w:type="table" w:styleId="736">
     <w:name w:val="Grid Table 5 Dark"/>
-    <w:basedOn w:val="665"/>
+    <w:basedOn w:val="887"/>
     <w:uiPriority w:val="99"/>
     <w:pPr>
       <w:pBdr/>
@@ -8597,9 +8617,9 @@
       </w:tcPr>
     </w:tblStylePr>
   </w:style>
-  <w:style w:type="table" w:styleId="48">
+  <w:style w:type="table" w:styleId="737">
     <w:name w:val="Grid Table 5 Dark- Accent 1"/>
-    <w:basedOn w:val="665"/>
+    <w:basedOn w:val="887"/>
     <w:uiPriority w:val="99"/>
     <w:pPr>
       <w:pBdr/>
@@ -8825,9 +8845,9 @@
       </w:tcPr>
     </w:tblStylePr>
   </w:style>
-  <w:style w:type="table" w:styleId="49">
+  <w:style w:type="table" w:styleId="738">
     <w:name w:val="Grid Table 5 Dark - Accent 2"/>
-    <w:basedOn w:val="665"/>
+    <w:basedOn w:val="887"/>
     <w:uiPriority w:val="99"/>
     <w:pPr>
       <w:pBdr/>
@@ -9053,9 +9073,9 @@
       </w:tcPr>
     </w:tblStylePr>
   </w:style>
-  <w:style w:type="table" w:styleId="50">
+  <w:style w:type="table" w:styleId="739">
     <w:name w:val="Grid Table 5 Dark - Accent 3"/>
-    <w:basedOn w:val="665"/>
+    <w:basedOn w:val="887"/>
     <w:uiPriority w:val="99"/>
     <w:pPr>
       <w:pBdr/>
@@ -9281,9 +9301,9 @@
       </w:tcPr>
     </w:tblStylePr>
   </w:style>
-  <w:style w:type="table" w:styleId="51">
+  <w:style w:type="table" w:styleId="740">
     <w:name w:val="Grid Table 5 Dark- Accent 4"/>
-    <w:basedOn w:val="665"/>
+    <w:basedOn w:val="887"/>
     <w:uiPriority w:val="99"/>
     <w:pPr>
       <w:pBdr/>
@@ -9509,9 +9529,9 @@
       </w:tcPr>
     </w:tblStylePr>
   </w:style>
-  <w:style w:type="table" w:styleId="52">
+  <w:style w:type="table" w:styleId="741">
     <w:name w:val="Grid Table 5 Dark - Accent 5"/>
-    <w:basedOn w:val="665"/>
+    <w:basedOn w:val="887"/>
     <w:uiPriority w:val="99"/>
     <w:pPr>
       <w:pBdr/>
@@ -9737,9 +9757,9 @@
       </w:tcPr>
     </w:tblStylePr>
   </w:style>
-  <w:style w:type="table" w:styleId="53">
+  <w:style w:type="table" w:styleId="742">
     <w:name w:val="Grid Table 5 Dark - Accent 6"/>
-    <w:basedOn w:val="665"/>
+    <w:basedOn w:val="887"/>
     <w:uiPriority w:val="99"/>
     <w:pPr>
       <w:pBdr/>
@@ -9965,9 +9985,9 @@
       </w:tcPr>
     </w:tblStylePr>
   </w:style>
-  <w:style w:type="table" w:styleId="54">
+  <w:style w:type="table" w:styleId="743">
     <w:name w:val="Grid Table 6 Colorful"/>
-    <w:basedOn w:val="665"/>
+    <w:basedOn w:val="887"/>
     <w:uiPriority w:val="99"/>
     <w:pPr>
       <w:pBdr/>
@@ -10195,9 +10215,9 @@
       </w:tcPr>
     </w:tblStylePr>
   </w:style>
-  <w:style w:type="table" w:styleId="55">
+  <w:style w:type="table" w:styleId="744">
     <w:name w:val="Grid Table 6 Colorful - Accent 1"/>
-    <w:basedOn w:val="665"/>
+    <w:basedOn w:val="887"/>
     <w:uiPriority w:val="99"/>
     <w:pPr>
       <w:pBdr/>
@@ -10425,9 +10445,9 @@
       </w:tcPr>
     </w:tblStylePr>
   </w:style>
-  <w:style w:type="table" w:styleId="56">
+  <w:style w:type="table" w:styleId="745">
     <w:name w:val="Grid Table 6 Colorful - Accent 2"/>
-    <w:basedOn w:val="665"/>
+    <w:basedOn w:val="887"/>
     <w:uiPriority w:val="99"/>
     <w:pPr>
       <w:pBdr/>
@@ -10655,9 +10675,9 @@
       </w:tcPr>
     </w:tblStylePr>
   </w:style>
-  <w:style w:type="table" w:styleId="57">
+  <w:style w:type="table" w:styleId="746">
     <w:name w:val="Grid Table 6 Colorful - Accent 3"/>
-    <w:basedOn w:val="665"/>
+    <w:basedOn w:val="887"/>
     <w:uiPriority w:val="99"/>
     <w:pPr>
       <w:pBdr/>
@@ -10885,9 +10905,9 @@
       </w:tcPr>
     </w:tblStylePr>
   </w:style>
-  <w:style w:type="table" w:styleId="58">
+  <w:style w:type="table" w:styleId="747">
     <w:name w:val="Grid Table 6 Colorful - Accent 4"/>
-    <w:basedOn w:val="665"/>
+    <w:basedOn w:val="887"/>
     <w:uiPriority w:val="99"/>
     <w:pPr>
       <w:pBdr/>
@@ -11115,9 +11135,9 @@
       </w:tcPr>
     </w:tblStylePr>
   </w:style>
-  <w:style w:type="table" w:styleId="59">
+  <w:style w:type="table" w:styleId="748">
     <w:name w:val="Grid Table 6 Colorful - Accent 5"/>
-    <w:basedOn w:val="665"/>
+    <w:basedOn w:val="887"/>
     <w:uiPriority w:val="99"/>
     <w:pPr>
       <w:pBdr/>
@@ -11345,9 +11365,9 @@
       </w:tcPr>
     </w:tblStylePr>
   </w:style>
-  <w:style w:type="table" w:styleId="60">
+  <w:style w:type="table" w:styleId="749">
     <w:name w:val="Grid Table 6 Colorful - Accent 6"/>
-    <w:basedOn w:val="665"/>
+    <w:basedOn w:val="887"/>
     <w:uiPriority w:val="99"/>
     <w:pPr>
       <w:pBdr/>
@@ -11575,9 +11595,9 @@
       </w:tcPr>
     </w:tblStylePr>
   </w:style>
-  <w:style w:type="table" w:styleId="61">
+  <w:style w:type="table" w:styleId="750">
     <w:name w:val="Grid Table 7 Colorful"/>
-    <w:basedOn w:val="665"/>
+    <w:basedOn w:val="887"/>
     <w:uiPriority w:val="99"/>
     <w:pPr>
       <w:pBdr/>
@@ -11679,11 +11699,11 @@
         <w:tblBorders/>
       </w:tblPr>
       <w:tcPr>
-        <w:shd w:color="ffffff"/>
+        <w:shd w:val="clear" w:color="ffffff"/>
         <w:tcBorders>
-          <w:top w:val="none"/>
-          <w:left w:val="none"/>
-          <w:bottom w:val="none"/>
+          <w:top w:val="none" w:color="000000" w:sz="4" w:space="0"/>
+          <w:left w:val="none" w:color="000000" w:sz="4" w:space="0"/>
+          <w:bottom w:val="none" w:color="000000" w:sz="4" w:space="0"/>
           <w:right w:val="single" w:color="000000" w:themeColor="text1" w:themeTint="80" w:sz="4" w:space="0"/>
         </w:tcBorders>
       </w:tcPr>
@@ -11706,10 +11726,10 @@
       <w:tcPr>
         <w:shd w:val="clear" w:color="ffffff" w:themeColor="light1" w:fill="ffffff" w:themeFill="light1"/>
         <w:tcBorders>
-          <w:top w:val="none"/>
-          <w:left w:val="none"/>
+          <w:top w:val="none" w:color="000000" w:sz="4" w:space="0"/>
+          <w:left w:val="none" w:color="000000" w:sz="4" w:space="0"/>
           <w:bottom w:val="single" w:color="000000" w:themeColor="text1" w:themeTint="80" w:sz="4" w:space="0"/>
-          <w:right w:val="none"/>
+          <w:right w:val="none" w:color="000000" w:sz="4" w:space="0"/>
         </w:tcBorders>
       </w:tcPr>
     </w:tblStylePr>
@@ -11729,12 +11749,12 @@
         <w:tblBorders/>
       </w:tblPr>
       <w:tcPr>
-        <w:shd w:color="ffffff"/>
+        <w:shd w:val="clear" w:color="ffffff"/>
         <w:tcBorders>
-          <w:top w:val="none"/>
+          <w:top w:val="none" w:color="000000" w:sz="4" w:space="0"/>
           <w:left w:val="single" w:color="000000" w:themeColor="text1" w:themeTint="80" w:sz="4" w:space="0"/>
-          <w:bottom w:val="none"/>
-          <w:right w:val="none"/>
+          <w:bottom w:val="none" w:color="000000" w:sz="4" w:space="0"/>
+          <w:right w:val="none" w:color="000000" w:sz="4" w:space="0"/>
         </w:tcBorders>
       </w:tcPr>
     </w:tblStylePr>
@@ -11757,9 +11777,9 @@
         <w:shd w:val="clear" w:color="ffffff" w:themeColor="light1" w:fill="ffffff" w:themeFill="light1"/>
         <w:tcBorders>
           <w:top w:val="single" w:color="000000" w:themeColor="text1" w:themeTint="80" w:sz="4" w:space="0"/>
-          <w:left w:val="none"/>
-          <w:bottom w:val="none"/>
-          <w:right w:val="none"/>
+          <w:left w:val="none" w:color="000000" w:sz="4" w:space="0"/>
+          <w:bottom w:val="none" w:color="000000" w:sz="4" w:space="0"/>
+          <w:right w:val="none" w:color="000000" w:sz="4" w:space="0"/>
         </w:tcBorders>
       </w:tcPr>
     </w:tblStylePr>
@@ -11829,9 +11849,9 @@
       </w:tcPr>
     </w:tblStylePr>
   </w:style>
-  <w:style w:type="table" w:styleId="62">
+  <w:style w:type="table" w:styleId="751">
     <w:name w:val="Grid Table 7 Colorful - Accent 1"/>
-    <w:basedOn w:val="665"/>
+    <w:basedOn w:val="887"/>
     <w:uiPriority w:val="99"/>
     <w:pPr>
       <w:pBdr/>
@@ -11933,11 +11953,11 @@
         <w:tblBorders/>
       </w:tblPr>
       <w:tcPr>
-        <w:shd w:color="ffffff"/>
+        <w:shd w:val="clear" w:color="ffffff"/>
         <w:tcBorders>
-          <w:top w:val="none"/>
-          <w:left w:val="none"/>
-          <w:bottom w:val="none"/>
+          <w:top w:val="none" w:color="000000" w:sz="4" w:space="0"/>
+          <w:left w:val="none" w:color="000000" w:sz="4" w:space="0"/>
+          <w:bottom w:val="none" w:color="000000" w:sz="4" w:space="0"/>
           <w:right w:val="single" w:color="000000" w:themeColor="accent1" w:themeTint="80" w:sz="4" w:space="0"/>
         </w:tcBorders>
       </w:tcPr>
@@ -11960,10 +11980,10 @@
       <w:tcPr>
         <w:shd w:val="clear" w:color="ffffff" w:themeColor="light1" w:fill="ffffff" w:themeFill="light1"/>
         <w:tcBorders>
-          <w:top w:val="none"/>
-          <w:left w:val="none"/>
+          <w:top w:val="none" w:color="000000" w:sz="4" w:space="0"/>
+          <w:left w:val="none" w:color="000000" w:sz="4" w:space="0"/>
           <w:bottom w:val="single" w:color="000000" w:themeColor="accent1" w:themeTint="80" w:sz="4" w:space="0"/>
-          <w:right w:val="none"/>
+          <w:right w:val="none" w:color="000000" w:sz="4" w:space="0"/>
         </w:tcBorders>
       </w:tcPr>
     </w:tblStylePr>
@@ -11983,12 +12003,12 @@
         <w:tblBorders/>
       </w:tblPr>
       <w:tcPr>
-        <w:shd w:color="ffffff"/>
+        <w:shd w:val="clear" w:color="ffffff"/>
         <w:tcBorders>
-          <w:top w:val="none"/>
+          <w:top w:val="none" w:color="000000" w:sz="4" w:space="0"/>
           <w:left w:val="single" w:color="000000" w:themeColor="accent1" w:themeTint="80" w:sz="4" w:space="0"/>
-          <w:bottom w:val="none"/>
-          <w:right w:val="none"/>
+          <w:bottom w:val="none" w:color="000000" w:sz="4" w:space="0"/>
+          <w:right w:val="none" w:color="000000" w:sz="4" w:space="0"/>
         </w:tcBorders>
       </w:tcPr>
     </w:tblStylePr>
@@ -12011,9 +12031,9 @@
         <w:shd w:val="clear" w:color="ffffff" w:themeColor="light1" w:fill="ffffff" w:themeFill="light1"/>
         <w:tcBorders>
           <w:top w:val="single" w:color="000000" w:themeColor="accent1" w:themeTint="80" w:sz="4" w:space="0"/>
-          <w:left w:val="none"/>
-          <w:bottom w:val="none"/>
-          <w:right w:val="none"/>
+          <w:left w:val="none" w:color="000000" w:sz="4" w:space="0"/>
+          <w:bottom w:val="none" w:color="000000" w:sz="4" w:space="0"/>
+          <w:right w:val="none" w:color="000000" w:sz="4" w:space="0"/>
         </w:tcBorders>
       </w:tcPr>
     </w:tblStylePr>
@@ -12083,9 +12103,9 @@
       </w:tcPr>
     </w:tblStylePr>
   </w:style>
-  <w:style w:type="table" w:styleId="63">
+  <w:style w:type="table" w:styleId="752">
     <w:name w:val="Grid Table 7 Colorful - Accent 2"/>
-    <w:basedOn w:val="665"/>
+    <w:basedOn w:val="887"/>
     <w:uiPriority w:val="99"/>
     <w:pPr>
       <w:pBdr/>
@@ -12187,11 +12207,11 @@
         <w:tblBorders/>
       </w:tblPr>
       <w:tcPr>
-        <w:shd w:color="ffffff"/>
+        <w:shd w:val="clear" w:color="ffffff"/>
         <w:tcBorders>
-          <w:top w:val="none"/>
-          <w:left w:val="none"/>
-          <w:bottom w:val="none"/>
+          <w:top w:val="none" w:color="000000" w:sz="4" w:space="0"/>
+          <w:left w:val="none" w:color="000000" w:sz="4" w:space="0"/>
+          <w:bottom w:val="none" w:color="000000" w:sz="4" w:space="0"/>
           <w:right w:val="single" w:color="000000" w:themeColor="accent2" w:themeTint="97" w:sz="4" w:space="0"/>
         </w:tcBorders>
       </w:tcPr>
@@ -12214,10 +12234,10 @@
       <w:tcPr>
         <w:shd w:val="clear" w:color="ffffff" w:themeColor="light1" w:fill="ffffff" w:themeFill="light1"/>
         <w:tcBorders>
-          <w:top w:val="none"/>
-          <w:left w:val="none"/>
+          <w:top w:val="none" w:color="000000" w:sz="4" w:space="0"/>
+          <w:left w:val="none" w:color="000000" w:sz="4" w:space="0"/>
           <w:bottom w:val="single" w:color="000000" w:themeColor="accent2" w:themeTint="97" w:sz="4" w:space="0"/>
-          <w:right w:val="none"/>
+          <w:right w:val="none" w:color="000000" w:sz="4" w:space="0"/>
         </w:tcBorders>
       </w:tcPr>
     </w:tblStylePr>
@@ -12237,12 +12257,12 @@
         <w:tblBorders/>
       </w:tblPr>
       <w:tcPr>
-        <w:shd w:color="ffffff"/>
+        <w:shd w:val="clear" w:color="ffffff"/>
         <w:tcBorders>
-          <w:top w:val="none"/>
+          <w:top w:val="none" w:color="000000" w:sz="4" w:space="0"/>
           <w:left w:val="single" w:color="000000" w:themeColor="accent2" w:themeTint="97" w:sz="4" w:space="0"/>
-          <w:bottom w:val="none"/>
-          <w:right w:val="none"/>
+          <w:bottom w:val="none" w:color="000000" w:sz="4" w:space="0"/>
+          <w:right w:val="none" w:color="000000" w:sz="4" w:space="0"/>
         </w:tcBorders>
       </w:tcPr>
     </w:tblStylePr>
@@ -12265,9 +12285,9 @@
         <w:shd w:val="clear" w:color="ffffff" w:themeColor="light1" w:fill="ffffff" w:themeFill="light1"/>
         <w:tcBorders>
           <w:top w:val="single" w:color="000000" w:themeColor="accent2" w:themeTint="97" w:sz="4" w:space="0"/>
-          <w:left w:val="none"/>
-          <w:bottom w:val="none"/>
-          <w:right w:val="none"/>
+          <w:left w:val="none" w:color="000000" w:sz="4" w:space="0"/>
+          <w:bottom w:val="none" w:color="000000" w:sz="4" w:space="0"/>
+          <w:right w:val="none" w:color="000000" w:sz="4" w:space="0"/>
         </w:tcBorders>
       </w:tcPr>
     </w:tblStylePr>
@@ -12337,9 +12357,9 @@
       </w:tcPr>
     </w:tblStylePr>
   </w:style>
-  <w:style w:type="table" w:styleId="64">
+  <w:style w:type="table" w:styleId="753">
     <w:name w:val="Grid Table 7 Colorful - Accent 3"/>
-    <w:basedOn w:val="665"/>
+    <w:basedOn w:val="887"/>
     <w:uiPriority w:val="99"/>
     <w:pPr>
       <w:pBdr/>
@@ -12441,11 +12461,11 @@
         <w:tblBorders/>
       </w:tblPr>
       <w:tcPr>
-        <w:shd w:color="ffffff"/>
+        <w:shd w:val="clear" w:color="ffffff"/>
         <w:tcBorders>
-          <w:top w:val="none"/>
-          <w:left w:val="none"/>
-          <w:bottom w:val="none"/>
+          <w:top w:val="none" w:color="000000" w:sz="4" w:space="0"/>
+          <w:left w:val="none" w:color="000000" w:sz="4" w:space="0"/>
+          <w:bottom w:val="none" w:color="000000" w:sz="4" w:space="0"/>
           <w:right w:val="single" w:color="000000" w:themeColor="accent3" w:themeTint="FE" w:sz="4" w:space="0"/>
         </w:tcBorders>
       </w:tcPr>
@@ -12468,10 +12488,10 @@
       <w:tcPr>
         <w:shd w:val="clear" w:color="ffffff" w:themeColor="light1" w:fill="ffffff" w:themeFill="light1"/>
         <w:tcBorders>
-          <w:top w:val="none"/>
-          <w:left w:val="none"/>
+          <w:top w:val="none" w:color="000000" w:sz="4" w:space="0"/>
+          <w:left w:val="none" w:color="000000" w:sz="4" w:space="0"/>
           <w:bottom w:val="single" w:color="000000" w:themeColor="accent3" w:themeTint="FE" w:sz="4" w:space="0"/>
-          <w:right w:val="none"/>
+          <w:right w:val="none" w:color="000000" w:sz="4" w:space="0"/>
         </w:tcBorders>
       </w:tcPr>
     </w:tblStylePr>
@@ -12491,12 +12511,12 @@
         <w:tblBorders/>
       </w:tblPr>
       <w:tcPr>
-        <w:shd w:color="ffffff"/>
+        <w:shd w:val="clear" w:color="ffffff"/>
         <w:tcBorders>
-          <w:top w:val="none"/>
+          <w:top w:val="none" w:color="000000" w:sz="4" w:space="0"/>
           <w:left w:val="single" w:color="000000" w:themeColor="accent3" w:themeTint="FE" w:sz="4" w:space="0"/>
-          <w:bottom w:val="none"/>
-          <w:right w:val="none"/>
+          <w:bottom w:val="none" w:color="000000" w:sz="4" w:space="0"/>
+          <w:right w:val="none" w:color="000000" w:sz="4" w:space="0"/>
         </w:tcBorders>
       </w:tcPr>
     </w:tblStylePr>
@@ -12519,9 +12539,9 @@
         <w:shd w:val="clear" w:color="ffffff" w:themeColor="light1" w:fill="ffffff" w:themeFill="light1"/>
         <w:tcBorders>
           <w:top w:val="single" w:color="000000" w:themeColor="accent3" w:themeTint="FE" w:sz="4" w:space="0"/>
-          <w:left w:val="none"/>
-          <w:bottom w:val="none"/>
-          <w:right w:val="none"/>
+          <w:left w:val="none" w:color="000000" w:sz="4" w:space="0"/>
+          <w:bottom w:val="none" w:color="000000" w:sz="4" w:space="0"/>
+          <w:right w:val="none" w:color="000000" w:sz="4" w:space="0"/>
         </w:tcBorders>
       </w:tcPr>
     </w:tblStylePr>
@@ -12591,9 +12611,9 @@
       </w:tcPr>
     </w:tblStylePr>
   </w:style>
-  <w:style w:type="table" w:styleId="65">
+  <w:style w:type="table" w:styleId="754">
     <w:name w:val="Grid Table 7 Colorful - Accent 4"/>
-    <w:basedOn w:val="665"/>
+    <w:basedOn w:val="887"/>
     <w:uiPriority w:val="99"/>
     <w:pPr>
       <w:pBdr/>
@@ -12695,11 +12715,11 @@
         <w:tblBorders/>
       </w:tblPr>
       <w:tcPr>
-        <w:shd w:color="ffffff"/>
+        <w:shd w:val="clear" w:color="ffffff"/>
         <w:tcBorders>
-          <w:top w:val="none"/>
-          <w:left w:val="none"/>
-          <w:bottom w:val="none"/>
+          <w:top w:val="none" w:color="000000" w:sz="4" w:space="0"/>
+          <w:left w:val="none" w:color="000000" w:sz="4" w:space="0"/>
+          <w:bottom w:val="none" w:color="000000" w:sz="4" w:space="0"/>
           <w:right w:val="single" w:color="000000" w:themeColor="accent4" w:themeTint="9A" w:sz="4" w:space="0"/>
         </w:tcBorders>
       </w:tcPr>
@@ -12722,10 +12742,10 @@
       <w:tcPr>
         <w:shd w:val="clear" w:color="ffffff" w:themeColor="light1" w:fill="ffffff" w:themeFill="light1"/>
         <w:tcBorders>
-          <w:top w:val="none"/>
-          <w:left w:val="none"/>
+          <w:top w:val="none" w:color="000000" w:sz="4" w:space="0"/>
+          <w:left w:val="none" w:color="000000" w:sz="4" w:space="0"/>
           <w:bottom w:val="single" w:color="000000" w:themeColor="accent4" w:themeTint="9A" w:sz="4" w:space="0"/>
-          <w:right w:val="none"/>
+          <w:right w:val="none" w:color="000000" w:sz="4" w:space="0"/>
         </w:tcBorders>
       </w:tcPr>
     </w:tblStylePr>
@@ -12745,12 +12765,12 @@
         <w:tblBorders/>
       </w:tblPr>
       <w:tcPr>
-        <w:shd w:color="ffffff"/>
+        <w:shd w:val="clear" w:color="ffffff"/>
         <w:tcBorders>
-          <w:top w:val="none"/>
+          <w:top w:val="none" w:color="000000" w:sz="4" w:space="0"/>
           <w:left w:val="single" w:color="000000" w:themeColor="accent4" w:themeTint="9A" w:sz="4" w:space="0"/>
-          <w:bottom w:val="none"/>
-          <w:right w:val="none"/>
+          <w:bottom w:val="none" w:color="000000" w:sz="4" w:space="0"/>
+          <w:right w:val="none" w:color="000000" w:sz="4" w:space="0"/>
         </w:tcBorders>
       </w:tcPr>
     </w:tblStylePr>
@@ -12773,9 +12793,9 @@
         <w:shd w:val="clear" w:color="ffffff" w:themeColor="light1" w:fill="ffffff" w:themeFill="light1"/>
         <w:tcBorders>
           <w:top w:val="single" w:color="000000" w:themeColor="accent4" w:themeTint="9A" w:sz="4" w:space="0"/>
-          <w:left w:val="none"/>
-          <w:bottom w:val="none"/>
-          <w:right w:val="none"/>
+          <w:left w:val="none" w:color="000000" w:sz="4" w:space="0"/>
+          <w:bottom w:val="none" w:color="000000" w:sz="4" w:space="0"/>
+          <w:right w:val="none" w:color="000000" w:sz="4" w:space="0"/>
         </w:tcBorders>
       </w:tcPr>
     </w:tblStylePr>
@@ -12845,9 +12865,9 @@
       </w:tcPr>
     </w:tblStylePr>
   </w:style>
-  <w:style w:type="table" w:styleId="66">
+  <w:style w:type="table" w:styleId="755">
     <w:name w:val="Grid Table 7 Colorful - Accent 5"/>
-    <w:basedOn w:val="665"/>
+    <w:basedOn w:val="887"/>
     <w:uiPriority w:val="99"/>
     <w:pPr>
       <w:pBdr/>
@@ -12949,11 +12969,11 @@
         <w:tblBorders/>
       </w:tblPr>
       <w:tcPr>
-        <w:shd w:color="ffffff"/>
+        <w:shd w:val="clear" w:color="ffffff"/>
         <w:tcBorders>
-          <w:top w:val="none"/>
-          <w:left w:val="none"/>
-          <w:bottom w:val="none"/>
+          <w:top w:val="none" w:color="000000" w:sz="4" w:space="0"/>
+          <w:left w:val="none" w:color="000000" w:sz="4" w:space="0"/>
+          <w:bottom w:val="none" w:color="000000" w:sz="4" w:space="0"/>
           <w:right w:val="single" w:color="000000" w:themeColor="accent5" w:themeTint="90" w:sz="4" w:space="0"/>
         </w:tcBorders>
       </w:tcPr>
@@ -12976,10 +12996,10 @@
       <w:tcPr>
         <w:shd w:val="clear" w:color="ffffff" w:themeColor="light1" w:fill="ffffff" w:themeFill="light1"/>
         <w:tcBorders>
-          <w:top w:val="none"/>
-          <w:left w:val="none"/>
+          <w:top w:val="none" w:color="000000" w:sz="4" w:space="0"/>
+          <w:left w:val="none" w:color="000000" w:sz="4" w:space="0"/>
           <w:bottom w:val="single" w:color="000000" w:themeColor="accent5" w:themeTint="90" w:sz="4" w:space="0"/>
-          <w:right w:val="none"/>
+          <w:right w:val="none" w:color="000000" w:sz="4" w:space="0"/>
         </w:tcBorders>
       </w:tcPr>
     </w:tblStylePr>
@@ -12999,12 +13019,12 @@
         <w:tblBorders/>
       </w:tblPr>
       <w:tcPr>
-        <w:shd w:color="ffffff"/>
+        <w:shd w:val="clear" w:color="ffffff"/>
         <w:tcBorders>
-          <w:top w:val="none"/>
+          <w:top w:val="none" w:color="000000" w:sz="4" w:space="0"/>
           <w:left w:val="single" w:color="000000" w:themeColor="accent5" w:themeTint="90" w:sz="4" w:space="0"/>
-          <w:bottom w:val="none"/>
-          <w:right w:val="none"/>
+          <w:bottom w:val="none" w:color="000000" w:sz="4" w:space="0"/>
+          <w:right w:val="none" w:color="000000" w:sz="4" w:space="0"/>
         </w:tcBorders>
       </w:tcPr>
     </w:tblStylePr>
@@ -13027,9 +13047,9 @@
         <w:shd w:val="clear" w:color="ffffff" w:themeColor="light1" w:fill="ffffff" w:themeFill="light1"/>
         <w:tcBorders>
           <w:top w:val="single" w:color="000000" w:themeColor="accent5" w:themeTint="90" w:sz="4" w:space="0"/>
-          <w:left w:val="none"/>
-          <w:bottom w:val="none"/>
-          <w:right w:val="none"/>
+          <w:left w:val="none" w:color="000000" w:sz="4" w:space="0"/>
+          <w:bottom w:val="none" w:color="000000" w:sz="4" w:space="0"/>
+          <w:right w:val="none" w:color="000000" w:sz="4" w:space="0"/>
         </w:tcBorders>
       </w:tcPr>
     </w:tblStylePr>
@@ -13099,9 +13119,9 @@
       </w:tcPr>
     </w:tblStylePr>
   </w:style>
-  <w:style w:type="table" w:styleId="67">
+  <w:style w:type="table" w:styleId="756">
     <w:name w:val="Grid Table 7 Colorful - Accent 6"/>
-    <w:basedOn w:val="665"/>
+    <w:basedOn w:val="887"/>
     <w:uiPriority w:val="99"/>
     <w:pPr>
       <w:pBdr/>
@@ -13203,11 +13223,11 @@
         <w:tblBorders/>
       </w:tblPr>
       <w:tcPr>
-        <w:shd w:color="ffffff"/>
+        <w:shd w:val="clear" w:color="ffffff"/>
         <w:tcBorders>
-          <w:top w:val="none"/>
-          <w:left w:val="none"/>
-          <w:bottom w:val="none"/>
+          <w:top w:val="none" w:color="000000" w:sz="4" w:space="0"/>
+          <w:left w:val="none" w:color="000000" w:sz="4" w:space="0"/>
+          <w:bottom w:val="none" w:color="000000" w:sz="4" w:space="0"/>
           <w:right w:val="single" w:color="000000" w:themeColor="accent6" w:themeTint="90" w:sz="4" w:space="0"/>
         </w:tcBorders>
       </w:tcPr>
@@ -13230,10 +13250,10 @@
       <w:tcPr>
         <w:shd w:val="clear" w:color="ffffff" w:themeColor="light1" w:fill="ffffff" w:themeFill="light1"/>
         <w:tcBorders>
-          <w:top w:val="none"/>
-          <w:left w:val="none"/>
+          <w:top w:val="none" w:color="000000" w:sz="4" w:space="0"/>
+          <w:left w:val="none" w:color="000000" w:sz="4" w:space="0"/>
           <w:bottom w:val="single" w:color="000000" w:themeColor="accent6" w:themeTint="90" w:sz="4" w:space="0"/>
-          <w:right w:val="none"/>
+          <w:right w:val="none" w:color="000000" w:sz="4" w:space="0"/>
         </w:tcBorders>
       </w:tcPr>
     </w:tblStylePr>
@@ -13253,12 +13273,12 @@
         <w:tblBorders/>
       </w:tblPr>
       <w:tcPr>
-        <w:shd w:color="ffffff"/>
+        <w:shd w:val="clear" w:color="ffffff"/>
         <w:tcBorders>
-          <w:top w:val="none"/>
+          <w:top w:val="none" w:color="000000" w:sz="4" w:space="0"/>
           <w:left w:val="single" w:color="000000" w:themeColor="accent6" w:themeTint="90" w:sz="4" w:space="0"/>
-          <w:bottom w:val="none"/>
-          <w:right w:val="none"/>
+          <w:bottom w:val="none" w:color="000000" w:sz="4" w:space="0"/>
+          <w:right w:val="none" w:color="000000" w:sz="4" w:space="0"/>
         </w:tcBorders>
       </w:tcPr>
     </w:tblStylePr>
@@ -13281,9 +13301,9 @@
         <w:shd w:val="clear" w:color="ffffff" w:themeColor="light1" w:fill="ffffff" w:themeFill="light1"/>
         <w:tcBorders>
           <w:top w:val="single" w:color="000000" w:themeColor="accent6" w:themeTint="90" w:sz="4" w:space="0"/>
-          <w:left w:val="none"/>
-          <w:bottom w:val="none"/>
-          <w:right w:val="none"/>
+          <w:left w:val="none" w:color="000000" w:sz="4" w:space="0"/>
+          <w:bottom w:val="none" w:color="000000" w:sz="4" w:space="0"/>
+          <w:right w:val="none" w:color="000000" w:sz="4" w:space="0"/>
         </w:tcBorders>
       </w:tcPr>
     </w:tblStylePr>
@@ -13353,9 +13373,9 @@
       </w:tcPr>
     </w:tblStylePr>
   </w:style>
-  <w:style w:type="table" w:styleId="68">
+  <w:style w:type="table" w:styleId="757">
     <w:name w:val="List Table 1 Light"/>
-    <w:basedOn w:val="665"/>
+    <w:basedOn w:val="887"/>
     <w:uiPriority w:val="99"/>
     <w:pPr>
       <w:pBdr/>
@@ -13569,9 +13589,9 @@
       </w:tcPr>
     </w:tblStylePr>
   </w:style>
-  <w:style w:type="table" w:styleId="69">
+  <w:style w:type="table" w:styleId="758">
     <w:name w:val="List Table 1 Light - Accent 1"/>
-    <w:basedOn w:val="665"/>
+    <w:basedOn w:val="887"/>
     <w:uiPriority w:val="99"/>
     <w:pPr>
       <w:pBdr/>
@@ -13785,9 +13805,9 @@
       </w:tcPr>
     </w:tblStylePr>
   </w:style>
-  <w:style w:type="table" w:styleId="70">
+  <w:style w:type="table" w:styleId="759">
     <w:name w:val="List Table 1 Light - Accent 2"/>
-    <w:basedOn w:val="665"/>
+    <w:basedOn w:val="887"/>
     <w:uiPriority w:val="99"/>
     <w:pPr>
       <w:pBdr/>
@@ -14001,9 +14021,9 @@
       </w:tcPr>
     </w:tblStylePr>
   </w:style>
-  <w:style w:type="table" w:styleId="71">
+  <w:style w:type="table" w:styleId="760">
     <w:name w:val="List Table 1 Light - Accent 3"/>
-    <w:basedOn w:val="665"/>
+    <w:basedOn w:val="887"/>
     <w:uiPriority w:val="99"/>
     <w:pPr>
       <w:pBdr/>
@@ -14217,9 +14237,9 @@
       </w:tcPr>
     </w:tblStylePr>
   </w:style>
-  <w:style w:type="table" w:styleId="72">
+  <w:style w:type="table" w:styleId="761">
     <w:name w:val="List Table 1 Light - Accent 4"/>
-    <w:basedOn w:val="665"/>
+    <w:basedOn w:val="887"/>
     <w:uiPriority w:val="99"/>
     <w:pPr>
       <w:pBdr/>
@@ -14433,9 +14453,9 @@
       </w:tcPr>
     </w:tblStylePr>
   </w:style>
-  <w:style w:type="table" w:styleId="73">
+  <w:style w:type="table" w:styleId="762">
     <w:name w:val="List Table 1 Light - Accent 5"/>
-    <w:basedOn w:val="665"/>
+    <w:basedOn w:val="887"/>
     <w:uiPriority w:val="99"/>
     <w:pPr>
       <w:pBdr/>
@@ -14649,9 +14669,9 @@
       </w:tcPr>
     </w:tblStylePr>
   </w:style>
-  <w:style w:type="table" w:styleId="74">
+  <w:style w:type="table" w:styleId="763">
     <w:name w:val="List Table 1 Light - Accent 6"/>
-    <w:basedOn w:val="665"/>
+    <w:basedOn w:val="887"/>
     <w:uiPriority w:val="99"/>
     <w:pPr>
       <w:pBdr/>
@@ -14865,9 +14885,9 @@
       </w:tcPr>
     </w:tblStylePr>
   </w:style>
-  <w:style w:type="table" w:styleId="75">
+  <w:style w:type="table" w:styleId="764">
     <w:name w:val="List Table 2"/>
-    <w:basedOn w:val="665"/>
+    <w:basedOn w:val="887"/>
     <w:uiPriority w:val="99"/>
     <w:pPr>
       <w:pBdr/>
@@ -15103,9 +15123,9 @@
       </w:tcPr>
     </w:tblStylePr>
   </w:style>
-  <w:style w:type="table" w:styleId="76">
+  <w:style w:type="table" w:styleId="765">
     <w:name w:val="List Table 2 - Accent 1"/>
-    <w:basedOn w:val="665"/>
+    <w:basedOn w:val="887"/>
     <w:uiPriority w:val="99"/>
     <w:pPr>
       <w:pBdr/>
@@ -15341,9 +15361,9 @@
       </w:tcPr>
     </w:tblStylePr>
   </w:style>
-  <w:style w:type="table" w:styleId="77">
+  <w:style w:type="table" w:styleId="766">
     <w:name w:val="List Table 2 - Accent 2"/>
-    <w:basedOn w:val="665"/>
+    <w:basedOn w:val="887"/>
     <w:uiPriority w:val="99"/>
     <w:pPr>
       <w:pBdr/>
@@ -15579,9 +15599,9 @@
       </w:tcPr>
     </w:tblStylePr>
   </w:style>
-  <w:style w:type="table" w:styleId="78">
+  <w:style w:type="table" w:styleId="767">
     <w:name w:val="List Table 2 - Accent 3"/>
-    <w:basedOn w:val="665"/>
+    <w:basedOn w:val="887"/>
     <w:uiPriority w:val="99"/>
     <w:pPr>
       <w:pBdr/>
@@ -15817,9 +15837,9 @@
       </w:tcPr>
     </w:tblStylePr>
   </w:style>
-  <w:style w:type="table" w:styleId="79">
+  <w:style w:type="table" w:styleId="768">
     <w:name w:val="List Table 2 - Accent 4"/>
-    <w:basedOn w:val="665"/>
+    <w:basedOn w:val="887"/>
     <w:uiPriority w:val="99"/>
     <w:pPr>
       <w:pBdr/>
@@ -16055,9 +16075,9 @@
       </w:tcPr>
     </w:tblStylePr>
   </w:style>
-  <w:style w:type="table" w:styleId="80">
+  <w:style w:type="table" w:styleId="769">
     <w:name w:val="List Table 2 - Accent 5"/>
-    <w:basedOn w:val="665"/>
+    <w:basedOn w:val="887"/>
     <w:uiPriority w:val="99"/>
     <w:pPr>
       <w:pBdr/>
@@ -16293,9 +16313,9 @@
       </w:tcPr>
     </w:tblStylePr>
   </w:style>
-  <w:style w:type="table" w:styleId="81">
+  <w:style w:type="table" w:styleId="770">
     <w:name w:val="List Table 2 - Accent 6"/>
-    <w:basedOn w:val="665"/>
+    <w:basedOn w:val="887"/>
     <w:uiPriority w:val="99"/>
     <w:pPr>
       <w:pBdr/>
@@ -16531,9 +16551,9 @@
       </w:tcPr>
     </w:tblStylePr>
   </w:style>
-  <w:style w:type="table" w:styleId="82">
+  <w:style w:type="table" w:styleId="771">
     <w:name w:val="List Table 3"/>
-    <w:basedOn w:val="665"/>
+    <w:basedOn w:val="887"/>
     <w:uiPriority w:val="99"/>
     <w:pPr>
       <w:pBdr/>
@@ -16759,9 +16779,9 @@
       </w:tcPr>
     </w:tblStylePr>
   </w:style>
-  <w:style w:type="table" w:styleId="83">
+  <w:style w:type="table" w:styleId="772">
     <w:name w:val="List Table 3 - Accent 1"/>
-    <w:basedOn w:val="665"/>
+    <w:basedOn w:val="887"/>
     <w:uiPriority w:val="99"/>
     <w:pPr>
       <w:pBdr/>
@@ -16987,9 +17007,9 @@
       </w:tcPr>
     </w:tblStylePr>
   </w:style>
-  <w:style w:type="table" w:styleId="84">
+  <w:style w:type="table" w:styleId="773">
     <w:name w:val="List Table 3 - Accent 2"/>
-    <w:basedOn w:val="665"/>
+    <w:basedOn w:val="887"/>
     <w:uiPriority w:val="99"/>
     <w:pPr>
       <w:pBdr/>
@@ -17215,9 +17235,9 @@
       </w:tcPr>
     </w:tblStylePr>
   </w:style>
-  <w:style w:type="table" w:styleId="85">
+  <w:style w:type="table" w:styleId="774">
     <w:name w:val="List Table 3 - Accent 3"/>
-    <w:basedOn w:val="665"/>
+    <w:basedOn w:val="887"/>
     <w:uiPriority w:val="99"/>
     <w:pPr>
       <w:pBdr/>
@@ -17443,9 +17463,9 @@
       </w:tcPr>
     </w:tblStylePr>
   </w:style>
-  <w:style w:type="table" w:styleId="86">
+  <w:style w:type="table" w:styleId="775">
     <w:name w:val="List Table 3 - Accent 4"/>
-    <w:basedOn w:val="665"/>
+    <w:basedOn w:val="887"/>
     <w:uiPriority w:val="99"/>
     <w:pPr>
       <w:pBdr/>
@@ -17671,9 +17691,9 @@
       </w:tcPr>
     </w:tblStylePr>
   </w:style>
-  <w:style w:type="table" w:styleId="87">
+  <w:style w:type="table" w:styleId="776">
     <w:name w:val="List Table 3 - Accent 5"/>
-    <w:basedOn w:val="665"/>
+    <w:basedOn w:val="887"/>
     <w:uiPriority w:val="99"/>
     <w:pPr>
       <w:pBdr/>
@@ -17899,9 +17919,9 @@
       </w:tcPr>
     </w:tblStylePr>
   </w:style>
-  <w:style w:type="table" w:styleId="88">
+  <w:style w:type="table" w:styleId="777">
     <w:name w:val="List Table 3 - Accent 6"/>
-    <w:basedOn w:val="665"/>
+    <w:basedOn w:val="887"/>
     <w:uiPriority w:val="99"/>
     <w:pPr>
       <w:pBdr/>
@@ -18127,9 +18147,9 @@
       </w:tcPr>
     </w:tblStylePr>
   </w:style>
-  <w:style w:type="table" w:styleId="89">
+  <w:style w:type="table" w:styleId="778">
     <w:name w:val="List Table 4"/>
-    <w:basedOn w:val="665"/>
+    <w:basedOn w:val="887"/>
     <w:uiPriority w:val="99"/>
     <w:pPr>
       <w:pBdr/>
@@ -18352,9 +18372,9 @@
       </w:tcPr>
     </w:tblStylePr>
   </w:style>
-  <w:style w:type="table" w:styleId="90">
+  <w:style w:type="table" w:styleId="779">
     <w:name w:val="List Table 4 - Accent 1"/>
-    <w:basedOn w:val="665"/>
+    <w:basedOn w:val="887"/>
     <w:uiPriority w:val="99"/>
     <w:pPr>
       <w:pBdr/>
@@ -18577,9 +18597,9 @@
       </w:tcPr>
     </w:tblStylePr>
   </w:style>
-  <w:style w:type="table" w:styleId="91">
+  <w:style w:type="table" w:styleId="780">
     <w:name w:val="List Table 4 - Accent 2"/>
-    <w:basedOn w:val="665"/>
+    <w:basedOn w:val="887"/>
     <w:uiPriority w:val="99"/>
     <w:pPr>
       <w:pBdr/>
@@ -18802,9 +18822,9 @@
       </w:tcPr>
     </w:tblStylePr>
   </w:style>
-  <w:style w:type="table" w:styleId="92">
+  <w:style w:type="table" w:styleId="781">
     <w:name w:val="List Table 4 - Accent 3"/>
-    <w:basedOn w:val="665"/>
+    <w:basedOn w:val="887"/>
     <w:uiPriority w:val="99"/>
     <w:pPr>
       <w:pBdr/>
@@ -19027,9 +19047,9 @@
       </w:tcPr>
     </w:tblStylePr>
   </w:style>
-  <w:style w:type="table" w:styleId="93">
+  <w:style w:type="table" w:styleId="782">
     <w:name w:val="List Table 4 - Accent 4"/>
-    <w:basedOn w:val="665"/>
+    <w:basedOn w:val="887"/>
     <w:uiPriority w:val="99"/>
     <w:pPr>
       <w:pBdr/>
@@ -19252,9 +19272,9 @@
       </w:tcPr>
     </w:tblStylePr>
   </w:style>
-  <w:style w:type="table" w:styleId="94">
+  <w:style w:type="table" w:styleId="783">
     <w:name w:val="List Table 4 - Accent 5"/>
-    <w:basedOn w:val="665"/>
+    <w:basedOn w:val="887"/>
     <w:uiPriority w:val="99"/>
     <w:pPr>
       <w:pBdr/>
@@ -19477,9 +19497,9 @@
       </w:tcPr>
     </w:tblStylePr>
   </w:style>
-  <w:style w:type="table" w:styleId="95">
+  <w:style w:type="table" w:styleId="784">
     <w:name w:val="List Table 4 - Accent 6"/>
-    <w:basedOn w:val="665"/>
+    <w:basedOn w:val="887"/>
     <w:uiPriority w:val="99"/>
     <w:pPr>
       <w:pBdr/>
@@ -19702,9 +19722,9 @@
       </w:tcPr>
     </w:tblStylePr>
   </w:style>
-  <w:style w:type="table" w:styleId="96">
+  <w:style w:type="table" w:styleId="785">
     <w:name w:val="List Table 5 Dark"/>
-    <w:basedOn w:val="665"/>
+    <w:basedOn w:val="887"/>
     <w:uiPriority w:val="99"/>
     <w:pPr>
       <w:pBdr/>
@@ -19944,9 +19964,9 @@
       </w:tcPr>
     </w:tblStylePr>
   </w:style>
-  <w:style w:type="table" w:styleId="97">
+  <w:style w:type="table" w:styleId="786">
     <w:name w:val="List Table 5 Dark - Accent 1"/>
-    <w:basedOn w:val="665"/>
+    <w:basedOn w:val="887"/>
     <w:uiPriority w:val="99"/>
     <w:pPr>
       <w:pBdr/>
@@ -20186,9 +20206,9 @@
       </w:tcPr>
     </w:tblStylePr>
   </w:style>
-  <w:style w:type="table" w:styleId="98">
+  <w:style w:type="table" w:styleId="787">
     <w:name w:val="List Table 5 Dark - Accent 2"/>
-    <w:basedOn w:val="665"/>
+    <w:basedOn w:val="887"/>
     <w:uiPriority w:val="99"/>
     <w:pPr>
       <w:pBdr/>
@@ -20428,9 +20448,9 @@
       </w:tcPr>
     </w:tblStylePr>
   </w:style>
-  <w:style w:type="table" w:styleId="99">
+  <w:style w:type="table" w:styleId="788">
     <w:name w:val="List Table 5 Dark - Accent 3"/>
-    <w:basedOn w:val="665"/>
+    <w:basedOn w:val="887"/>
     <w:uiPriority w:val="99"/>
     <w:pPr>
       <w:pBdr/>
@@ -20670,9 +20690,9 @@
       </w:tcPr>
     </w:tblStylePr>
   </w:style>
-  <w:style w:type="table" w:styleId="100">
+  <w:style w:type="table" w:styleId="789">
     <w:name w:val="List Table 5 Dark - Accent 4"/>
-    <w:basedOn w:val="665"/>
+    <w:basedOn w:val="887"/>
     <w:uiPriority w:val="99"/>
     <w:pPr>
       <w:pBdr/>
@@ -20912,9 +20932,9 @@
       </w:tcPr>
     </w:tblStylePr>
   </w:style>
-  <w:style w:type="table" w:styleId="101">
+  <w:style w:type="table" w:styleId="790">
     <w:name w:val="List Table 5 Dark - Accent 5"/>
-    <w:basedOn w:val="665"/>
+    <w:basedOn w:val="887"/>
     <w:uiPriority w:val="99"/>
     <w:pPr>
       <w:pBdr/>
@@ -21154,9 +21174,9 @@
       </w:tcPr>
     </w:tblStylePr>
   </w:style>
-  <w:style w:type="table" w:styleId="102">
+  <w:style w:type="table" w:styleId="791">
     <w:name w:val="List Table 5 Dark - Accent 6"/>
-    <w:basedOn w:val="665"/>
+    <w:basedOn w:val="887"/>
     <w:uiPriority w:val="99"/>
     <w:pPr>
       <w:pBdr/>
@@ -21396,9 +21416,9 @@
       </w:tcPr>
     </w:tblStylePr>
   </w:style>
-  <w:style w:type="table" w:styleId="103">
+  <w:style w:type="table" w:styleId="792">
     <w:name w:val="List Table 6 Colorful"/>
-    <w:basedOn w:val="665"/>
+    <w:basedOn w:val="887"/>
     <w:uiPriority w:val="99"/>
     <w:pPr>
       <w:pBdr/>
@@ -21619,9 +21639,9 @@
       </w:tcPr>
     </w:tblStylePr>
   </w:style>
-  <w:style w:type="table" w:styleId="104">
+  <w:style w:type="table" w:styleId="793">
     <w:name w:val="List Table 6 Colorful - Accent 1"/>
-    <w:basedOn w:val="665"/>
+    <w:basedOn w:val="887"/>
     <w:uiPriority w:val="99"/>
     <w:pPr>
       <w:pBdr/>
@@ -21842,9 +21862,9 @@
       </w:tcPr>
     </w:tblStylePr>
   </w:style>
-  <w:style w:type="table" w:styleId="105">
+  <w:style w:type="table" w:styleId="794">
     <w:name w:val="List Table 6 Colorful - Accent 2"/>
-    <w:basedOn w:val="665"/>
+    <w:basedOn w:val="887"/>
     <w:uiPriority w:val="99"/>
     <w:pPr>
       <w:pBdr/>
@@ -22065,9 +22085,9 @@
       </w:tcPr>
     </w:tblStylePr>
   </w:style>
-  <w:style w:type="table" w:styleId="106">
+  <w:style w:type="table" w:styleId="795">
     <w:name w:val="List Table 6 Colorful - Accent 3"/>
-    <w:basedOn w:val="665"/>
+    <w:basedOn w:val="887"/>
     <w:uiPriority w:val="99"/>
     <w:pPr>
       <w:pBdr/>
@@ -22288,9 +22308,9 @@
       </w:tcPr>
     </w:tblStylePr>
   </w:style>
-  <w:style w:type="table" w:styleId="107">
+  <w:style w:type="table" w:styleId="796">
     <w:name w:val="List Table 6 Colorful - Accent 4"/>
-    <w:basedOn w:val="665"/>
+    <w:basedOn w:val="887"/>
     <w:uiPriority w:val="99"/>
     <w:pPr>
       <w:pBdr/>
@@ -22511,9 +22531,9 @@
       </w:tcPr>
     </w:tblStylePr>
   </w:style>
-  <w:style w:type="table" w:styleId="108">
+  <w:style w:type="table" w:styleId="797">
     <w:name w:val="List Table 6 Colorful - Accent 5"/>
-    <w:basedOn w:val="665"/>
+    <w:basedOn w:val="887"/>
     <w:uiPriority w:val="99"/>
     <w:pPr>
       <w:pBdr/>
@@ -22734,9 +22754,9 @@
       </w:tcPr>
     </w:tblStylePr>
   </w:style>
-  <w:style w:type="table" w:styleId="109">
+  <w:style w:type="table" w:styleId="798">
     <w:name w:val="List Table 6 Colorful - Accent 6"/>
-    <w:basedOn w:val="665"/>
+    <w:basedOn w:val="887"/>
     <w:uiPriority w:val="99"/>
     <w:pPr>
       <w:pBdr/>
@@ -22957,9 +22977,9 @@
       </w:tcPr>
     </w:tblStylePr>
   </w:style>
-  <w:style w:type="table" w:styleId="110">
+  <w:style w:type="table" w:styleId="799">
     <w:name w:val="List Table 7 Colorful"/>
-    <w:basedOn w:val="665"/>
+    <w:basedOn w:val="887"/>
     <w:uiPriority w:val="99"/>
     <w:pPr>
       <w:pBdr/>
@@ -23058,11 +23078,11 @@
         <w:tblBorders/>
       </w:tblPr>
       <w:tcPr>
-        <w:shd w:color="ffffff"/>
+        <w:shd w:val="clear" w:color="ffffff"/>
         <w:tcBorders>
-          <w:top w:val="none"/>
-          <w:left w:val="none"/>
-          <w:bottom w:val="none"/>
+          <w:top w:val="none" w:color="000000" w:sz="4" w:space="0"/>
+          <w:left w:val="none" w:color="000000" w:sz="4" w:space="0"/>
+          <w:bottom w:val="none" w:color="000000" w:sz="4" w:space="0"/>
           <w:right w:val="single" w:color="000000" w:themeColor="text1" w:themeTint="80" w:sz="4" w:space="0"/>
         </w:tcBorders>
       </w:tcPr>
@@ -23085,10 +23105,10 @@
       <w:tcPr>
         <w:shd w:val="clear" w:color="ffffff" w:themeColor="light1" w:fill="ffffff" w:themeFill="light1"/>
         <w:tcBorders>
-          <w:top w:val="none"/>
-          <w:left w:val="none"/>
+          <w:top w:val="none" w:color="000000" w:sz="4" w:space="0"/>
+          <w:left w:val="none" w:color="000000" w:sz="4" w:space="0"/>
           <w:bottom w:val="single" w:color="000000" w:themeColor="text1" w:themeTint="80" w:sz="4" w:space="0"/>
-          <w:right w:val="none"/>
+          <w:right w:val="none" w:color="000000" w:sz="4" w:space="0"/>
         </w:tcBorders>
       </w:tcPr>
     </w:tblStylePr>
@@ -23108,12 +23128,12 @@
         <w:tblBorders/>
       </w:tblPr>
       <w:tcPr>
-        <w:shd w:color="ffffff"/>
+        <w:shd w:val="clear" w:color="ffffff"/>
         <w:tcBorders>
-          <w:top w:val="none"/>
+          <w:top w:val="none" w:color="000000" w:sz="4" w:space="0"/>
           <w:left w:val="single" w:color="000000" w:themeColor="text1" w:themeTint="80" w:sz="4" w:space="0"/>
-          <w:bottom w:val="none"/>
-          <w:right w:val="none"/>
+          <w:bottom w:val="none" w:color="000000" w:sz="4" w:space="0"/>
+          <w:right w:val="none" w:color="000000" w:sz="4" w:space="0"/>
         </w:tcBorders>
       </w:tcPr>
     </w:tblStylePr>
@@ -23136,9 +23156,9 @@
         <w:shd w:val="clear" w:color="ffffff" w:themeColor="light1" w:fill="ffffff" w:themeFill="light1"/>
         <w:tcBorders>
           <w:top w:val="single" w:color="000000" w:themeColor="text1" w:themeTint="80" w:sz="4" w:space="0"/>
-          <w:left w:val="none"/>
-          <w:bottom w:val="none"/>
-          <w:right w:val="none"/>
+          <w:left w:val="none" w:color="000000" w:sz="4" w:space="0"/>
+          <w:bottom w:val="none" w:color="000000" w:sz="4" w:space="0"/>
+          <w:right w:val="none" w:color="000000" w:sz="4" w:space="0"/>
         </w:tcBorders>
       </w:tcPr>
     </w:tblStylePr>
@@ -23213,9 +23233,9 @@
       </w:tcPr>
     </w:tblStylePr>
   </w:style>
-  <w:style w:type="table" w:styleId="111">
+  <w:style w:type="table" w:styleId="800">
     <w:name w:val="List Table 7 Colorful - Accent 1"/>
-    <w:basedOn w:val="665"/>
+    <w:basedOn w:val="887"/>
     <w:uiPriority w:val="99"/>
     <w:pPr>
       <w:pBdr/>
@@ -23314,11 +23334,11 @@
         <w:tblBorders/>
       </w:tblPr>
       <w:tcPr>
-        <w:shd w:color="ffffff"/>
+        <w:shd w:val="clear" w:color="ffffff"/>
         <w:tcBorders>
-          <w:top w:val="none"/>
-          <w:left w:val="none"/>
-          <w:bottom w:val="none"/>
+          <w:top w:val="none" w:color="000000" w:sz="4" w:space="0"/>
+          <w:left w:val="none" w:color="000000" w:sz="4" w:space="0"/>
+          <w:bottom w:val="none" w:color="000000" w:sz="4" w:space="0"/>
           <w:right w:val="single" w:color="000000" w:themeColor="accent1" w:sz="4" w:space="0"/>
         </w:tcBorders>
       </w:tcPr>
@@ -23341,10 +23361,10 @@
       <w:tcPr>
         <w:shd w:val="clear" w:color="ffffff" w:themeColor="light1" w:fill="ffffff" w:themeFill="light1"/>
         <w:tcBorders>
-          <w:top w:val="none"/>
-          <w:left w:val="none"/>
+          <w:top w:val="none" w:color="000000" w:sz="4" w:space="0"/>
+          <w:left w:val="none" w:color="000000" w:sz="4" w:space="0"/>
           <w:bottom w:val="single" w:color="000000" w:themeColor="accent1" w:sz="4" w:space="0"/>
-          <w:right w:val="none"/>
+          <w:right w:val="none" w:color="000000" w:sz="4" w:space="0"/>
         </w:tcBorders>
       </w:tcPr>
     </w:tblStylePr>
@@ -23364,12 +23384,12 @@
         <w:tblBorders/>
       </w:tblPr>
       <w:tcPr>
-        <w:shd w:color="ffffff"/>
+        <w:shd w:val="clear" w:color="ffffff"/>
         <w:tcBorders>
-          <w:top w:val="none"/>
+          <w:top w:val="none" w:color="000000" w:sz="4" w:space="0"/>
           <w:left w:val="single" w:color="000000" w:themeColor="accent1" w:sz="4" w:space="0"/>
-          <w:bottom w:val="none"/>
-          <w:right w:val="none"/>
+          <w:bottom w:val="none" w:color="000000" w:sz="4" w:space="0"/>
+          <w:right w:val="none" w:color="000000" w:sz="4" w:space="0"/>
         </w:tcBorders>
       </w:tcPr>
     </w:tblStylePr>
@@ -23392,9 +23412,9 @@
         <w:shd w:val="clear" w:color="ffffff" w:themeColor="light1" w:fill="ffffff" w:themeFill="light1"/>
         <w:tcBorders>
           <w:top w:val="single" w:color="000000" w:themeColor="accent1" w:sz="4" w:space="0"/>
-          <w:left w:val="none"/>
-          <w:bottom w:val="none"/>
-          <w:right w:val="none"/>
+          <w:left w:val="none" w:color="000000" w:sz="4" w:space="0"/>
+          <w:bottom w:val="none" w:color="000000" w:sz="4" w:space="0"/>
+          <w:right w:val="none" w:color="000000" w:sz="4" w:space="0"/>
         </w:tcBorders>
       </w:tcPr>
     </w:tblStylePr>
@@ -23469,9 +23489,9 @@
       </w:tcPr>
     </w:tblStylePr>
   </w:style>
-  <w:style w:type="table" w:styleId="112">
+  <w:style w:type="table" w:styleId="801">
     <w:name w:val="List Table 7 Colorful - Accent 2"/>
-    <w:basedOn w:val="665"/>
+    <w:basedOn w:val="887"/>
     <w:uiPriority w:val="99"/>
     <w:pPr>
       <w:pBdr/>
@@ -23570,11 +23590,11 @@
         <w:tblBorders/>
       </w:tblPr>
       <w:tcPr>
-        <w:shd w:color="ffffff"/>
+        <w:shd w:val="clear" w:color="ffffff"/>
         <w:tcBorders>
-          <w:top w:val="none"/>
-          <w:left w:val="none"/>
-          <w:bottom w:val="none"/>
+          <w:top w:val="none" w:color="000000" w:sz="4" w:space="0"/>
+          <w:left w:val="none" w:color="000000" w:sz="4" w:space="0"/>
+          <w:bottom w:val="none" w:color="000000" w:sz="4" w:space="0"/>
           <w:right w:val="single" w:color="000000" w:themeColor="accent2" w:themeTint="97" w:sz="4" w:space="0"/>
         </w:tcBorders>
       </w:tcPr>
@@ -23597,10 +23617,10 @@
       <w:tcPr>
         <w:shd w:val="clear" w:color="ffffff" w:themeColor="light1" w:fill="ffffff" w:themeFill="light1"/>
         <w:tcBorders>
-          <w:top w:val="none"/>
-          <w:left w:val="none"/>
+          <w:top w:val="none" w:color="000000" w:sz="4" w:space="0"/>
+          <w:left w:val="none" w:color="000000" w:sz="4" w:space="0"/>
           <w:bottom w:val="single" w:color="000000" w:themeColor="accent2" w:themeTint="97" w:sz="4" w:space="0"/>
-          <w:right w:val="none"/>
+          <w:right w:val="none" w:color="000000" w:sz="4" w:space="0"/>
         </w:tcBorders>
       </w:tcPr>
     </w:tblStylePr>
@@ -23620,12 +23640,12 @@
         <w:tblBorders/>
       </w:tblPr>
       <w:tcPr>
-        <w:shd w:color="ffffff"/>
+        <w:shd w:val="clear" w:color="ffffff"/>
         <w:tcBorders>
-          <w:top w:val="none"/>
+          <w:top w:val="none" w:color="000000" w:sz="4" w:space="0"/>
           <w:left w:val="single" w:color="000000" w:themeColor="accent2" w:themeTint="97" w:sz="4" w:space="0"/>
-          <w:bottom w:val="none"/>
-          <w:right w:val="none"/>
+          <w:bottom w:val="none" w:color="000000" w:sz="4" w:space="0"/>
+          <w:right w:val="none" w:color="000000" w:sz="4" w:space="0"/>
         </w:tcBorders>
       </w:tcPr>
     </w:tblStylePr>
@@ -23648,9 +23668,9 @@
         <w:shd w:val="clear" w:color="ffffff" w:themeColor="light1" w:fill="ffffff" w:themeFill="light1"/>
         <w:tcBorders>
           <w:top w:val="single" w:color="000000" w:themeColor="accent2" w:themeTint="97" w:sz="4" w:space="0"/>
-          <w:left w:val="none"/>
-          <w:bottom w:val="none"/>
-          <w:right w:val="none"/>
+          <w:left w:val="none" w:color="000000" w:sz="4" w:space="0"/>
+          <w:bottom w:val="none" w:color="000000" w:sz="4" w:space="0"/>
+          <w:right w:val="none" w:color="000000" w:sz="4" w:space="0"/>
         </w:tcBorders>
       </w:tcPr>
     </w:tblStylePr>
@@ -23725,9 +23745,9 @@
       </w:tcPr>
     </w:tblStylePr>
   </w:style>
-  <w:style w:type="table" w:styleId="113">
+  <w:style w:type="table" w:styleId="802">
     <w:name w:val="List Table 7 Colorful - Accent 3"/>
-    <w:basedOn w:val="665"/>
+    <w:basedOn w:val="887"/>
     <w:uiPriority w:val="99"/>
     <w:pPr>
       <w:pBdr/>
@@ -23826,11 +23846,11 @@
         <w:tblBorders/>
       </w:tblPr>
       <w:tcPr>
-        <w:shd w:color="ffffff"/>
+        <w:shd w:val="clear" w:color="ffffff"/>
         <w:tcBorders>
-          <w:top w:val="none"/>
-          <w:left w:val="none"/>
-          <w:bottom w:val="none"/>
+          <w:top w:val="none" w:color="000000" w:sz="4" w:space="0"/>
+          <w:left w:val="none" w:color="000000" w:sz="4" w:space="0"/>
+          <w:bottom w:val="none" w:color="000000" w:sz="4" w:space="0"/>
           <w:right w:val="single" w:color="000000" w:themeColor="accent3" w:themeTint="98" w:sz="4" w:space="0"/>
         </w:tcBorders>
       </w:tcPr>
@@ -23853,10 +23873,10 @@
       <w:tcPr>
         <w:shd w:val="clear" w:color="ffffff" w:themeColor="light1" w:fill="ffffff" w:themeFill="light1"/>
         <w:tcBorders>
-          <w:top w:val="none"/>
-          <w:left w:val="none"/>
+          <w:top w:val="none" w:color="000000" w:sz="4" w:space="0"/>
+          <w:left w:val="none" w:color="000000" w:sz="4" w:space="0"/>
           <w:bottom w:val="single" w:color="000000" w:themeColor="accent3" w:themeTint="98" w:sz="4" w:space="0"/>
-          <w:right w:val="none"/>
+          <w:right w:val="none" w:color="000000" w:sz="4" w:space="0"/>
         </w:tcBorders>
       </w:tcPr>
     </w:tblStylePr>
@@ -23876,12 +23896,12 @@
         <w:tblBorders/>
       </w:tblPr>
       <w:tcPr>
-        <w:shd w:color="ffffff"/>
+        <w:shd w:val="clear" w:color="ffffff"/>
         <w:tcBorders>
-          <w:top w:val="none"/>
+          <w:top w:val="none" w:color="000000" w:sz="4" w:space="0"/>
           <w:left w:val="single" w:color="000000" w:themeColor="accent3" w:themeTint="98" w:sz="4" w:space="0"/>
-          <w:bottom w:val="none"/>
-          <w:right w:val="none"/>
+          <w:bottom w:val="none" w:color="000000" w:sz="4" w:space="0"/>
+          <w:right w:val="none" w:color="000000" w:sz="4" w:space="0"/>
         </w:tcBorders>
       </w:tcPr>
     </w:tblStylePr>
@@ -23904,9 +23924,9 @@
         <w:shd w:val="clear" w:color="ffffff" w:themeColor="light1" w:fill="ffffff" w:themeFill="light1"/>
         <w:tcBorders>
           <w:top w:val="single" w:color="000000" w:themeColor="accent3" w:themeTint="98" w:sz="4" w:space="0"/>
-          <w:left w:val="none"/>
-          <w:bottom w:val="none"/>
-          <w:right w:val="none"/>
+          <w:left w:val="none" w:color="000000" w:sz="4" w:space="0"/>
+          <w:bottom w:val="none" w:color="000000" w:sz="4" w:space="0"/>
+          <w:right w:val="none" w:color="000000" w:sz="4" w:space="0"/>
         </w:tcBorders>
       </w:tcPr>
     </w:tblStylePr>
@@ -23981,9 +24001,9 @@
       </w:tcPr>
     </w:tblStylePr>
   </w:style>
-  <w:style w:type="table" w:styleId="114">
+  <w:style w:type="table" w:styleId="803">
     <w:name w:val="List Table 7 Colorful - Accent 4"/>
-    <w:basedOn w:val="665"/>
+    <w:basedOn w:val="887"/>
     <w:uiPriority w:val="99"/>
     <w:pPr>
       <w:pBdr/>
@@ -24082,11 +24102,11 @@
         <w:tblBorders/>
       </w:tblPr>
       <w:tcPr>
-        <w:shd w:color="ffffff"/>
+        <w:shd w:val="clear" w:color="ffffff"/>
         <w:tcBorders>
-          <w:top w:val="none"/>
-          <w:left w:val="none"/>
-          <w:bottom w:val="none"/>
+          <w:top w:val="none" w:color="000000" w:sz="4" w:space="0"/>
+          <w:left w:val="none" w:color="000000" w:sz="4" w:space="0"/>
+          <w:bottom w:val="none" w:color="000000" w:sz="4" w:space="0"/>
           <w:right w:val="single" w:color="000000" w:themeColor="accent4" w:themeTint="9A" w:sz="4" w:space="0"/>
         </w:tcBorders>
       </w:tcPr>
@@ -24109,10 +24129,10 @@
       <w:tcPr>
         <w:shd w:val="clear" w:color="ffffff" w:themeColor="light1" w:fill="ffffff" w:themeFill="light1"/>
         <w:tcBorders>
-          <w:top w:val="none"/>
-          <w:left w:val="none"/>
+          <w:top w:val="none" w:color="000000" w:sz="4" w:space="0"/>
+          <w:left w:val="none" w:color="000000" w:sz="4" w:space="0"/>
           <w:bottom w:val="single" w:color="000000" w:themeColor="accent4" w:themeTint="9A" w:sz="4" w:space="0"/>
-          <w:right w:val="none"/>
+          <w:right w:val="none" w:color="000000" w:sz="4" w:space="0"/>
         </w:tcBorders>
       </w:tcPr>
     </w:tblStylePr>
@@ -24132,12 +24152,12 @@
         <w:tblBorders/>
       </w:tblPr>
       <w:tcPr>
-        <w:shd w:color="ffffff"/>
+        <w:shd w:val="clear" w:color="ffffff"/>
         <w:tcBorders>
-          <w:top w:val="none"/>
+          <w:top w:val="none" w:color="000000" w:sz="4" w:space="0"/>
           <w:left w:val="single" w:color="000000" w:themeColor="accent4" w:themeTint="9A" w:sz="4" w:space="0"/>
-          <w:bottom w:val="none"/>
-          <w:right w:val="none"/>
+          <w:bottom w:val="none" w:color="000000" w:sz="4" w:space="0"/>
+          <w:right w:val="none" w:color="000000" w:sz="4" w:space="0"/>
         </w:tcBorders>
       </w:tcPr>
     </w:tblStylePr>
@@ -24160,9 +24180,9 @@
         <w:shd w:val="clear" w:color="ffffff" w:themeColor="light1" w:fill="ffffff" w:themeFill="light1"/>
         <w:tcBorders>
           <w:top w:val="single" w:color="000000" w:themeColor="accent4" w:themeTint="9A" w:sz="4" w:space="0"/>
-          <w:left w:val="none"/>
-          <w:bottom w:val="none"/>
-          <w:right w:val="none"/>
+          <w:left w:val="none" w:color="000000" w:sz="4" w:space="0"/>
+          <w:bottom w:val="none" w:color="000000" w:sz="4" w:space="0"/>
+          <w:right w:val="none" w:color="000000" w:sz="4" w:space="0"/>
         </w:tcBorders>
       </w:tcPr>
     </w:tblStylePr>
@@ -24237,9 +24257,9 @@
       </w:tcPr>
     </w:tblStylePr>
   </w:style>
-  <w:style w:type="table" w:styleId="115">
+  <w:style w:type="table" w:styleId="804">
     <w:name w:val="List Table 7 Colorful - Accent 5"/>
-    <w:basedOn w:val="665"/>
+    <w:basedOn w:val="887"/>
     <w:uiPriority w:val="99"/>
     <w:pPr>
       <w:pBdr/>
@@ -24338,11 +24358,11 @@
         <w:tblBorders/>
       </w:tblPr>
       <w:tcPr>
-        <w:shd w:color="ffffff"/>
+        <w:shd w:val="clear" w:color="ffffff"/>
         <w:tcBorders>
-          <w:top w:val="none"/>
-          <w:left w:val="none"/>
-          <w:bottom w:val="none"/>
+          <w:top w:val="none" w:color="000000" w:sz="4" w:space="0"/>
+          <w:left w:val="none" w:color="000000" w:sz="4" w:space="0"/>
+          <w:bottom w:val="none" w:color="000000" w:sz="4" w:space="0"/>
           <w:right w:val="single" w:color="000000" w:themeColor="accent5" w:themeTint="9A" w:sz="4" w:space="0"/>
         </w:tcBorders>
       </w:tcPr>
@@ -24365,10 +24385,10 @@
       <w:tcPr>
         <w:shd w:val="clear" w:color="ffffff" w:themeColor="light1" w:fill="ffffff" w:themeFill="light1"/>
         <w:tcBorders>
-          <w:top w:val="none"/>
-          <w:left w:val="none"/>
+          <w:top w:val="none" w:color="000000" w:sz="4" w:space="0"/>
+          <w:left w:val="none" w:color="000000" w:sz="4" w:space="0"/>
           <w:bottom w:val="single" w:color="000000" w:themeColor="accent5" w:themeTint="9A" w:sz="4" w:space="0"/>
-          <w:right w:val="none"/>
+          <w:right w:val="none" w:color="000000" w:sz="4" w:space="0"/>
         </w:tcBorders>
       </w:tcPr>
     </w:tblStylePr>
@@ -24388,12 +24408,12 @@
         <w:tblBorders/>
       </w:tblPr>
       <w:tcPr>
-        <w:shd w:color="ffffff"/>
+        <w:shd w:val="clear" w:color="ffffff"/>
         <w:tcBorders>
-          <w:top w:val="none"/>
+          <w:top w:val="none" w:color="000000" w:sz="4" w:space="0"/>
           <w:left w:val="single" w:color="000000" w:themeColor="accent5" w:themeTint="9A" w:sz="4" w:space="0"/>
-          <w:bottom w:val="none"/>
-          <w:right w:val="none"/>
+          <w:bottom w:val="none" w:color="000000" w:sz="4" w:space="0"/>
+          <w:right w:val="none" w:color="000000" w:sz="4" w:space="0"/>
         </w:tcBorders>
       </w:tcPr>
     </w:tblStylePr>
@@ -24416,9 +24436,9 @@
         <w:shd w:val="clear" w:color="ffffff" w:themeColor="light1" w:fill="ffffff" w:themeFill="light1"/>
         <w:tcBorders>
           <w:top w:val="single" w:color="000000" w:themeColor="accent5" w:themeTint="9A" w:sz="4" w:space="0"/>
-          <w:left w:val="none"/>
-          <w:bottom w:val="none"/>
-          <w:right w:val="none"/>
+          <w:left w:val="none" w:color="000000" w:sz="4" w:space="0"/>
+          <w:bottom w:val="none" w:color="000000" w:sz="4" w:space="0"/>
+          <w:right w:val="none" w:color="000000" w:sz="4" w:space="0"/>
         </w:tcBorders>
       </w:tcPr>
     </w:tblStylePr>
@@ -24493,9 +24513,9 @@
       </w:tcPr>
     </w:tblStylePr>
   </w:style>
-  <w:style w:type="table" w:styleId="116">
+  <w:style w:type="table" w:styleId="805">
     <w:name w:val="List Table 7 Colorful - Accent 6"/>
-    <w:basedOn w:val="665"/>
+    <w:basedOn w:val="887"/>
     <w:uiPriority w:val="99"/>
     <w:pPr>
       <w:pBdr/>
@@ -24594,11 +24614,11 @@
         <w:tblBorders/>
       </w:tblPr>
       <w:tcPr>
-        <w:shd w:color="ffffff"/>
+        <w:shd w:val="clear" w:color="ffffff"/>
         <w:tcBorders>
-          <w:top w:val="none"/>
-          <w:left w:val="none"/>
-          <w:bottom w:val="none"/>
+          <w:top w:val="none" w:color="000000" w:sz="4" w:space="0"/>
+          <w:left w:val="none" w:color="000000" w:sz="4" w:space="0"/>
+          <w:bottom w:val="none" w:color="000000" w:sz="4" w:space="0"/>
           <w:right w:val="single" w:color="000000" w:themeColor="accent6" w:themeTint="98" w:sz="4" w:space="0"/>
         </w:tcBorders>
       </w:tcPr>
@@ -24621,10 +24641,10 @@
       <w:tcPr>
         <w:shd w:val="clear" w:color="ffffff" w:themeColor="light1" w:fill="ffffff" w:themeFill="light1"/>
         <w:tcBorders>
-          <w:top w:val="none"/>
-          <w:left w:val="none"/>
+          <w:top w:val="none" w:color="000000" w:sz="4" w:space="0"/>
+          <w:left w:val="none" w:color="000000" w:sz="4" w:space="0"/>
           <w:bottom w:val="single" w:color="000000" w:themeColor="accent6" w:themeTint="98" w:sz="4" w:space="0"/>
-          <w:right w:val="none"/>
+          <w:right w:val="none" w:color="000000" w:sz="4" w:space="0"/>
         </w:tcBorders>
       </w:tcPr>
     </w:tblStylePr>
@@ -24644,12 +24664,12 @@
         <w:tblBorders/>
       </w:tblPr>
       <w:tcPr>
-        <w:shd w:color="ffffff"/>
+        <w:shd w:val="clear" w:color="ffffff"/>
         <w:tcBorders>
-          <w:top w:val="none"/>
+          <w:top w:val="none" w:color="000000" w:sz="4" w:space="0"/>
           <w:left w:val="single" w:color="000000" w:themeColor="accent6" w:themeTint="98" w:sz="4" w:space="0"/>
-          <w:bottom w:val="none"/>
-          <w:right w:val="none"/>
+          <w:bottom w:val="none" w:color="000000" w:sz="4" w:space="0"/>
+          <w:right w:val="none" w:color="000000" w:sz="4" w:space="0"/>
         </w:tcBorders>
       </w:tcPr>
     </w:tblStylePr>
@@ -24672,9 +24692,9 @@
         <w:shd w:val="clear" w:color="ffffff" w:themeColor="light1" w:fill="ffffff" w:themeFill="light1"/>
         <w:tcBorders>
           <w:top w:val="single" w:color="000000" w:themeColor="accent6" w:themeTint="98" w:sz="4" w:space="0"/>
-          <w:left w:val="none"/>
-          <w:bottom w:val="none"/>
-          <w:right w:val="none"/>
+          <w:left w:val="none" w:color="000000" w:sz="4" w:space="0"/>
+          <w:bottom w:val="none" w:color="000000" w:sz="4" w:space="0"/>
+          <w:right w:val="none" w:color="000000" w:sz="4" w:space="0"/>
         </w:tcBorders>
       </w:tcPr>
     </w:tblStylePr>
@@ -24749,9 +24769,9 @@
       </w:tcPr>
     </w:tblStylePr>
   </w:style>
-  <w:style w:type="table" w:styleId="117">
+  <w:style w:type="table" w:styleId="806">
     <w:name w:val="Lined - Accent"/>
-    <w:basedOn w:val="665"/>
+    <w:basedOn w:val="887"/>
     <w:uiPriority w:val="99"/>
     <w:pPr>
       <w:pBdr/>
@@ -24986,9 +25006,9 @@
       </w:tcPr>
     </w:tblStylePr>
   </w:style>
-  <w:style w:type="table" w:styleId="118">
+  <w:style w:type="table" w:styleId="807">
     <w:name w:val="Lined - Accent 1"/>
-    <w:basedOn w:val="665"/>
+    <w:basedOn w:val="887"/>
     <w:uiPriority w:val="99"/>
     <w:pPr>
       <w:pBdr/>
@@ -25223,9 +25243,9 @@
       </w:tcPr>
     </w:tblStylePr>
   </w:style>
-  <w:style w:type="table" w:styleId="119">
+  <w:style w:type="table" w:styleId="808">
     <w:name w:val="Lined - Accent 2"/>
-    <w:basedOn w:val="665"/>
+    <w:basedOn w:val="887"/>
     <w:uiPriority w:val="99"/>
     <w:pPr>
       <w:pBdr/>
@@ -25460,9 +25480,9 @@
       </w:tcPr>
     </w:tblStylePr>
   </w:style>
-  <w:style w:type="table" w:styleId="120">
+  <w:style w:type="table" w:styleId="809">
     <w:name w:val="Lined - Accent 3"/>
-    <w:basedOn w:val="665"/>
+    <w:basedOn w:val="887"/>
     <w:uiPriority w:val="99"/>
     <w:pPr>
       <w:pBdr/>
@@ -25697,9 +25717,9 @@
       </w:tcPr>
     </w:tblStylePr>
   </w:style>
-  <w:style w:type="table" w:styleId="121">
+  <w:style w:type="table" w:styleId="810">
     <w:name w:val="Lined - Accent 4"/>
-    <w:basedOn w:val="665"/>
+    <w:basedOn w:val="887"/>
     <w:uiPriority w:val="99"/>
     <w:pPr>
       <w:pBdr/>
@@ -25934,9 +25954,9 @@
       </w:tcPr>
     </w:tblStylePr>
   </w:style>
-  <w:style w:type="table" w:styleId="122">
+  <w:style w:type="table" w:styleId="811">
     <w:name w:val="Lined - Accent 5"/>
-    <w:basedOn w:val="665"/>
+    <w:basedOn w:val="887"/>
     <w:uiPriority w:val="99"/>
     <w:pPr>
       <w:pBdr/>
@@ -26171,9 +26191,9 @@
       </w:tcPr>
     </w:tblStylePr>
   </w:style>
-  <w:style w:type="table" w:styleId="123">
+  <w:style w:type="table" w:styleId="812">
     <w:name w:val="Lined - Accent 6"/>
-    <w:basedOn w:val="665"/>
+    <w:basedOn w:val="887"/>
     <w:uiPriority w:val="99"/>
     <w:pPr>
       <w:pBdr/>
@@ -26408,9 +26428,9 @@
       </w:tcPr>
     </w:tblStylePr>
   </w:style>
-  <w:style w:type="table" w:styleId="124">
+  <w:style w:type="table" w:styleId="813">
     <w:name w:val="Bordered &amp; Lined - Accent"/>
-    <w:basedOn w:val="665"/>
+    <w:basedOn w:val="887"/>
     <w:uiPriority w:val="99"/>
     <w:pPr>
       <w:pBdr/>
@@ -26652,9 +26672,9 @@
       </w:tcPr>
     </w:tblStylePr>
   </w:style>
-  <w:style w:type="table" w:styleId="125">
+  <w:style w:type="table" w:styleId="814">
     <w:name w:val="Bordered &amp; Lined - Accent 1"/>
-    <w:basedOn w:val="665"/>
+    <w:basedOn w:val="887"/>
     <w:uiPriority w:val="99"/>
     <w:pPr>
       <w:pBdr/>
@@ -26896,9 +26916,9 @@
       </w:tcPr>
     </w:tblStylePr>
   </w:style>
-  <w:style w:type="table" w:styleId="126">
+  <w:style w:type="table" w:styleId="815">
     <w:name w:val="Bordered &amp; Lined - Accent 2"/>
-    <w:basedOn w:val="665"/>
+    <w:basedOn w:val="887"/>
     <w:uiPriority w:val="99"/>
     <w:pPr>
       <w:pBdr/>
@@ -27140,9 +27160,9 @@
       </w:tcPr>
     </w:tblStylePr>
   </w:style>
-  <w:style w:type="table" w:styleId="127">
+  <w:style w:type="table" w:styleId="816">
     <w:name w:val="Bordered &amp; Lined - Accent 3"/>
-    <w:basedOn w:val="665"/>
+    <w:basedOn w:val="887"/>
     <w:uiPriority w:val="99"/>
     <w:pPr>
       <w:pBdr/>
@@ -27384,9 +27404,9 @@
       </w:tcPr>
     </w:tblStylePr>
   </w:style>
-  <w:style w:type="table" w:styleId="128">
+  <w:style w:type="table" w:styleId="817">
     <w:name w:val="Bordered &amp; Lined - Accent 4"/>
-    <w:basedOn w:val="665"/>
+    <w:basedOn w:val="887"/>
     <w:uiPriority w:val="99"/>
     <w:pPr>
       <w:pBdr/>
@@ -27628,9 +27648,9 @@
       </w:tcPr>
     </w:tblStylePr>
   </w:style>
-  <w:style w:type="table" w:styleId="129">
+  <w:style w:type="table" w:styleId="818">
     <w:name w:val="Bordered &amp; Lined - Accent 5"/>
-    <w:basedOn w:val="665"/>
+    <w:basedOn w:val="887"/>
     <w:uiPriority w:val="99"/>
     <w:pPr>
       <w:pBdr/>
@@ -27872,9 +27892,9 @@
       </w:tcPr>
     </w:tblStylePr>
   </w:style>
-  <w:style w:type="table" w:styleId="130">
+  <w:style w:type="table" w:styleId="819">
     <w:name w:val="Bordered &amp; Lined - Accent 6"/>
-    <w:basedOn w:val="665"/>
+    <w:basedOn w:val="887"/>
     <w:uiPriority w:val="99"/>
     <w:pPr>
       <w:pBdr/>
@@ -28116,9 +28136,9 @@
       </w:tcPr>
     </w:tblStylePr>
   </w:style>
-  <w:style w:type="table" w:styleId="131">
+  <w:style w:type="table" w:styleId="820">
     <w:name w:val="Bordered"/>
-    <w:basedOn w:val="665"/>
+    <w:basedOn w:val="887"/>
     <w:uiPriority w:val="99"/>
     <w:pPr>
       <w:pBdr/>
@@ -28347,9 +28367,9 @@
       </w:tcPr>
     </w:tblStylePr>
   </w:style>
-  <w:style w:type="table" w:styleId="132">
+  <w:style w:type="table" w:styleId="821">
     <w:name w:val="Bordered - Accent 1"/>
-    <w:basedOn w:val="665"/>
+    <w:basedOn w:val="887"/>
     <w:uiPriority w:val="99"/>
     <w:pPr>
       <w:pBdr/>
@@ -28578,9 +28598,9 @@
       </w:tcPr>
     </w:tblStylePr>
   </w:style>
-  <w:style w:type="table" w:styleId="133">
+  <w:style w:type="table" w:styleId="822">
     <w:name w:val="Bordered - Accent 2"/>
-    <w:basedOn w:val="665"/>
+    <w:basedOn w:val="887"/>
     <w:uiPriority w:val="99"/>
     <w:pPr>
       <w:pBdr/>
@@ -28809,9 +28829,9 @@
       </w:tcPr>
     </w:tblStylePr>
   </w:style>
-  <w:style w:type="table" w:styleId="134">
+  <w:style w:type="table" w:styleId="823">
     <w:name w:val="Bordered - Accent 3"/>
-    <w:basedOn w:val="665"/>
+    <w:basedOn w:val="887"/>
     <w:uiPriority w:val="99"/>
     <w:pPr>
       <w:pBdr/>
@@ -29040,9 +29060,9 @@
       </w:tcPr>
     </w:tblStylePr>
   </w:style>
-  <w:style w:type="table" w:styleId="135">
+  <w:style w:type="table" w:styleId="824">
     <w:name w:val="Bordered - Accent 4"/>
-    <w:basedOn w:val="665"/>
+    <w:basedOn w:val="887"/>
     <w:uiPriority w:val="99"/>
     <w:pPr>
       <w:pBdr/>
@@ -29271,9 +29291,9 @@
       </w:tcPr>
     </w:tblStylePr>
   </w:style>
-  <w:style w:type="table" w:styleId="136">
+  <w:style w:type="table" w:styleId="825">
     <w:name w:val="Bordered - Accent 5"/>
-    <w:basedOn w:val="665"/>
+    <w:basedOn w:val="887"/>
     <w:uiPriority w:val="99"/>
     <w:pPr>
       <w:pBdr/>
@@ -29502,9 +29522,9 @@
       </w:tcPr>
     </w:tblStylePr>
   </w:style>
-  <w:style w:type="table" w:styleId="137">
+  <w:style w:type="table" w:styleId="826">
     <w:name w:val="Bordered - Accent 6"/>
-    <w:basedOn w:val="665"/>
+    <w:basedOn w:val="887"/>
     <w:uiPriority w:val="99"/>
     <w:pPr>
       <w:pBdr/>
@@ -29733,11 +29753,11 @@
       </w:tcPr>
     </w:tblStylePr>
   </w:style>
-  <w:style w:type="paragraph" w:styleId="139">
+  <w:style w:type="paragraph" w:styleId="827">
     <w:name w:val="Heading 1"/>
-    <w:basedOn w:val="664"/>
-    <w:next w:val="664"/>
-    <w:link w:val="150"/>
+    <w:basedOn w:val="886"/>
+    <w:next w:val="886"/>
+    <w:link w:val="837"/>
     <w:uiPriority w:val="9"/>
     <w:qFormat/>
     <w:pPr>
@@ -29755,11 +29775,11 @@
       <w:szCs w:val="40"/>
     </w:rPr>
   </w:style>
-  <w:style w:type="paragraph" w:styleId="140">
+  <w:style w:type="paragraph" w:styleId="828">
     <w:name w:val="Heading 2"/>
-    <w:basedOn w:val="664"/>
-    <w:next w:val="664"/>
-    <w:link w:val="151"/>
+    <w:basedOn w:val="886"/>
+    <w:next w:val="886"/>
+    <w:link w:val="838"/>
     <w:uiPriority w:val="9"/>
     <w:unhideWhenUsed/>
     <w:qFormat/>
@@ -29778,11 +29798,11 @@
       <w:szCs w:val="32"/>
     </w:rPr>
   </w:style>
-  <w:style w:type="paragraph" w:styleId="141">
+  <w:style w:type="paragraph" w:styleId="829">
     <w:name w:val="Heading 3"/>
-    <w:basedOn w:val="664"/>
-    <w:next w:val="664"/>
-    <w:link w:val="152"/>
+    <w:basedOn w:val="886"/>
+    <w:next w:val="886"/>
+    <w:link w:val="839"/>
     <w:uiPriority w:val="9"/>
     <w:unhideWhenUsed/>
     <w:qFormat/>
@@ -29801,11 +29821,11 @@
       <w:szCs w:val="28"/>
     </w:rPr>
   </w:style>
-  <w:style w:type="paragraph" w:styleId="142">
+  <w:style w:type="paragraph" w:styleId="830">
     <w:name w:val="Heading 4"/>
-    <w:basedOn w:val="664"/>
-    <w:next w:val="664"/>
-    <w:link w:val="153"/>
+    <w:basedOn w:val="886"/>
+    <w:next w:val="886"/>
+    <w:link w:val="840"/>
     <w:uiPriority w:val="9"/>
     <w:unhideWhenUsed/>
     <w:qFormat/>
@@ -29824,11 +29844,11 @@
       <w:color w:val="0f4761" w:themeColor="accent1" w:themeShade="BF"/>
     </w:rPr>
   </w:style>
-  <w:style w:type="paragraph" w:styleId="143">
+  <w:style w:type="paragraph" w:styleId="831">
     <w:name w:val="Heading 5"/>
-    <w:basedOn w:val="664"/>
-    <w:next w:val="664"/>
-    <w:link w:val="154"/>
+    <w:basedOn w:val="886"/>
+    <w:next w:val="886"/>
+    <w:link w:val="841"/>
     <w:uiPriority w:val="9"/>
     <w:unhideWhenUsed/>
     <w:qFormat/>
@@ -29845,11 +29865,11 @@
       <w:color w:val="0f4761" w:themeColor="accent1" w:themeShade="BF"/>
     </w:rPr>
   </w:style>
-  <w:style w:type="paragraph" w:styleId="144">
+  <w:style w:type="paragraph" w:styleId="832">
     <w:name w:val="Heading 6"/>
-    <w:basedOn w:val="664"/>
-    <w:next w:val="664"/>
-    <w:link w:val="155"/>
+    <w:basedOn w:val="886"/>
+    <w:next w:val="886"/>
+    <w:link w:val="842"/>
     <w:uiPriority w:val="9"/>
     <w:unhideWhenUsed/>
     <w:qFormat/>
@@ -29868,11 +29888,11 @@
       <w:color w:val="595959" w:themeColor="text1" w:themeTint="A6"/>
     </w:rPr>
   </w:style>
-  <w:style w:type="paragraph" w:styleId="145">
+  <w:style w:type="paragraph" w:styleId="833">
     <w:name w:val="Heading 7"/>
-    <w:basedOn w:val="664"/>
-    <w:next w:val="664"/>
-    <w:link w:val="156"/>
+    <w:basedOn w:val="886"/>
+    <w:next w:val="886"/>
+    <w:link w:val="843"/>
     <w:uiPriority w:val="9"/>
     <w:unhideWhenUsed/>
     <w:qFormat/>
@@ -29889,11 +29909,11 @@
       <w:color w:val="595959" w:themeColor="text1" w:themeTint="A6"/>
     </w:rPr>
   </w:style>
-  <w:style w:type="paragraph" w:styleId="146">
+  <w:style w:type="paragraph" w:styleId="834">
     <w:name w:val="Heading 8"/>
-    <w:basedOn w:val="664"/>
-    <w:next w:val="664"/>
-    <w:link w:val="157"/>
+    <w:basedOn w:val="886"/>
+    <w:next w:val="886"/>
+    <w:link w:val="844"/>
     <w:uiPriority w:val="9"/>
     <w:unhideWhenUsed/>
     <w:qFormat/>
@@ -29912,11 +29932,11 @@
       <w:color w:val="272727" w:themeColor="text1" w:themeTint="D8"/>
     </w:rPr>
   </w:style>
-  <w:style w:type="paragraph" w:styleId="147">
+  <w:style w:type="paragraph" w:styleId="835">
     <w:name w:val="Heading 9"/>
-    <w:basedOn w:val="664"/>
-    <w:next w:val="664"/>
-    <w:link w:val="158"/>
+    <w:basedOn w:val="886"/>
+    <w:next w:val="886"/>
+    <w:link w:val="845"/>
     <w:uiPriority w:val="9"/>
     <w:unhideWhenUsed/>
     <w:qFormat/>
@@ -29935,7 +29955,7 @@
       <w:color w:val="272727" w:themeColor="text1" w:themeTint="D8"/>
     </w:rPr>
   </w:style>
-  <w:style w:type="character" w:styleId="148" w:default="1">
+  <w:style w:type="character" w:styleId="836" w:default="1">
     <w:name w:val="Default Paragraph Font"/>
     <w:uiPriority w:val="1"/>
     <w:semiHidden/>
@@ -29946,10 +29966,10 @@
       <w:ind/>
     </w:pPr>
   </w:style>
-  <w:style w:type="character" w:styleId="150">
+  <w:style w:type="character" w:styleId="837">
     <w:name w:val="Heading 1 Char"/>
-    <w:basedOn w:val="148"/>
-    <w:link w:val="139"/>
+    <w:basedOn w:val="836"/>
+    <w:link w:val="827"/>
     <w:uiPriority w:val="9"/>
     <w:pPr>
       <w:pBdr/>
@@ -29963,10 +29983,10 @@
       <w:szCs w:val="40"/>
     </w:rPr>
   </w:style>
-  <w:style w:type="character" w:styleId="151">
+  <w:style w:type="character" w:styleId="838">
     <w:name w:val="Heading 2 Char"/>
-    <w:basedOn w:val="148"/>
-    <w:link w:val="140"/>
+    <w:basedOn w:val="836"/>
+    <w:link w:val="828"/>
     <w:uiPriority w:val="9"/>
     <w:pPr>
       <w:pBdr/>
@@ -29980,10 +30000,10 @@
       <w:szCs w:val="32"/>
     </w:rPr>
   </w:style>
-  <w:style w:type="character" w:styleId="152">
+  <w:style w:type="character" w:styleId="839">
     <w:name w:val="Heading 3 Char"/>
-    <w:basedOn w:val="148"/>
-    <w:link w:val="141"/>
+    <w:basedOn w:val="836"/>
+    <w:link w:val="829"/>
     <w:uiPriority w:val="9"/>
     <w:pPr>
       <w:pBdr/>
@@ -29997,10 +30017,10 @@
       <w:szCs w:val="28"/>
     </w:rPr>
   </w:style>
-  <w:style w:type="character" w:styleId="153">
+  <w:style w:type="character" w:styleId="840">
     <w:name w:val="Heading 4 Char"/>
-    <w:basedOn w:val="148"/>
-    <w:link w:val="142"/>
+    <w:basedOn w:val="836"/>
+    <w:link w:val="830"/>
     <w:uiPriority w:val="9"/>
     <w:pPr>
       <w:pBdr/>
@@ -30014,10 +30034,10 @@
       <w:color w:val="0f4761" w:themeColor="accent1" w:themeShade="BF"/>
     </w:rPr>
   </w:style>
-  <w:style w:type="character" w:styleId="154">
+  <w:style w:type="character" w:styleId="841">
     <w:name w:val="Heading 5 Char"/>
-    <w:basedOn w:val="148"/>
-    <w:link w:val="143"/>
+    <w:basedOn w:val="836"/>
+    <w:link w:val="831"/>
     <w:uiPriority w:val="9"/>
     <w:pPr>
       <w:pBdr/>
@@ -30029,10 +30049,10 @@
       <w:color w:val="0f4761" w:themeColor="accent1" w:themeShade="BF"/>
     </w:rPr>
   </w:style>
-  <w:style w:type="character" w:styleId="155">
+  <w:style w:type="character" w:styleId="842">
     <w:name w:val="Heading 6 Char"/>
-    <w:basedOn w:val="148"/>
-    <w:link w:val="144"/>
+    <w:basedOn w:val="836"/>
+    <w:link w:val="832"/>
     <w:uiPriority w:val="9"/>
     <w:pPr>
       <w:pBdr/>
@@ -30046,10 +30066,10 @@
       <w:color w:val="595959" w:themeColor="text1" w:themeTint="A6"/>
     </w:rPr>
   </w:style>
-  <w:style w:type="character" w:styleId="156">
+  <w:style w:type="character" w:styleId="843">
     <w:name w:val="Heading 7 Char"/>
-    <w:basedOn w:val="148"/>
-    <w:link w:val="145"/>
+    <w:basedOn w:val="836"/>
+    <w:link w:val="833"/>
     <w:uiPriority w:val="9"/>
     <w:pPr>
       <w:pBdr/>
@@ -30061,10 +30081,10 @@
       <w:color w:val="595959" w:themeColor="text1" w:themeTint="A6"/>
     </w:rPr>
   </w:style>
-  <w:style w:type="character" w:styleId="157">
+  <w:style w:type="character" w:styleId="844">
     <w:name w:val="Heading 8 Char"/>
-    <w:basedOn w:val="148"/>
-    <w:link w:val="146"/>
+    <w:basedOn w:val="836"/>
+    <w:link w:val="834"/>
     <w:uiPriority w:val="9"/>
     <w:pPr>
       <w:pBdr/>
@@ -30078,10 +30098,10 @@
       <w:color w:val="272727" w:themeColor="text1" w:themeTint="D8"/>
     </w:rPr>
   </w:style>
-  <w:style w:type="character" w:styleId="158">
+  <w:style w:type="character" w:styleId="845">
     <w:name w:val="Heading 9 Char"/>
-    <w:basedOn w:val="148"/>
-    <w:link w:val="147"/>
+    <w:basedOn w:val="836"/>
+    <w:link w:val="835"/>
     <w:uiPriority w:val="9"/>
     <w:pPr>
       <w:pBdr/>
@@ -30095,11 +30115,11 @@
       <w:color w:val="272727" w:themeColor="text1" w:themeTint="D8"/>
     </w:rPr>
   </w:style>
-  <w:style w:type="paragraph" w:styleId="159">
+  <w:style w:type="paragraph" w:styleId="846">
     <w:name w:val="Title"/>
-    <w:basedOn w:val="664"/>
-    <w:next w:val="664"/>
-    <w:link w:val="160"/>
+    <w:basedOn w:val="886"/>
+    <w:next w:val="886"/>
+    <w:link w:val="847"/>
     <w:uiPriority w:val="10"/>
     <w:qFormat/>
     <w:pPr>
@@ -30115,10 +30135,10 @@
       <w:szCs w:val="56"/>
     </w:rPr>
   </w:style>
-  <w:style w:type="character" w:styleId="160">
+  <w:style w:type="character" w:styleId="847">
     <w:name w:val="Title Char"/>
-    <w:basedOn w:val="148"/>
-    <w:link w:val="159"/>
+    <w:basedOn w:val="836"/>
+    <w:link w:val="846"/>
     <w:uiPriority w:val="10"/>
     <w:pPr>
       <w:pBdr/>
@@ -30132,11 +30152,11 @@
       <w:szCs w:val="56"/>
     </w:rPr>
   </w:style>
-  <w:style w:type="paragraph" w:styleId="161">
+  <w:style w:type="paragraph" w:styleId="848">
     <w:name w:val="Subtitle"/>
-    <w:basedOn w:val="664"/>
-    <w:next w:val="664"/>
-    <w:link w:val="162"/>
+    <w:basedOn w:val="886"/>
+    <w:next w:val="886"/>
+    <w:link w:val="849"/>
     <w:uiPriority w:val="11"/>
     <w:qFormat/>
     <w:pPr>
@@ -30154,10 +30174,10 @@
       <w:szCs w:val="28"/>
     </w:rPr>
   </w:style>
-  <w:style w:type="character" w:styleId="162">
+  <w:style w:type="character" w:styleId="849">
     <w:name w:val="Subtitle Char"/>
-    <w:basedOn w:val="148"/>
-    <w:link w:val="161"/>
+    <w:basedOn w:val="836"/>
+    <w:link w:val="848"/>
     <w:uiPriority w:val="11"/>
     <w:pPr>
       <w:pBdr/>
@@ -30171,11 +30191,11 @@
       <w:szCs w:val="28"/>
     </w:rPr>
   </w:style>
-  <w:style w:type="paragraph" w:styleId="163">
+  <w:style w:type="paragraph" w:styleId="850">
     <w:name w:val="Quote"/>
-    <w:basedOn w:val="664"/>
-    <w:next w:val="664"/>
-    <w:link w:val="164"/>
+    <w:basedOn w:val="886"/>
+    <w:next w:val="886"/>
+    <w:link w:val="851"/>
     <w:uiPriority w:val="29"/>
     <w:qFormat/>
     <w:pPr>
@@ -30190,10 +30210,10 @@
       <w:color w:val="404040" w:themeColor="text1" w:themeTint="BF"/>
     </w:rPr>
   </w:style>
-  <w:style w:type="character" w:styleId="164">
+  <w:style w:type="character" w:styleId="851">
     <w:name w:val="Quote Char"/>
-    <w:basedOn w:val="148"/>
-    <w:link w:val="163"/>
+    <w:basedOn w:val="836"/>
+    <w:link w:val="850"/>
     <w:uiPriority w:val="29"/>
     <w:pPr>
       <w:pBdr/>
@@ -30206,9 +30226,9 @@
       <w:color w:val="404040" w:themeColor="text1" w:themeTint="BF"/>
     </w:rPr>
   </w:style>
-  <w:style w:type="character" w:styleId="166">
+  <w:style w:type="character" w:styleId="852">
     <w:name w:val="Intense Emphasis"/>
-    <w:basedOn w:val="148"/>
+    <w:basedOn w:val="836"/>
     <w:uiPriority w:val="21"/>
     <w:qFormat/>
     <w:pPr>
@@ -30222,11 +30242,11 @@
       <w:color w:val="0f4761" w:themeColor="accent1" w:themeShade="BF"/>
     </w:rPr>
   </w:style>
-  <w:style w:type="paragraph" w:styleId="167">
+  <w:style w:type="paragraph" w:styleId="853">
     <w:name w:val="Intense Quote"/>
-    <w:basedOn w:val="664"/>
-    <w:next w:val="664"/>
-    <w:link w:val="168"/>
+    <w:basedOn w:val="886"/>
+    <w:next w:val="886"/>
+    <w:link w:val="854"/>
     <w:uiPriority w:val="30"/>
     <w:qFormat/>
     <w:pPr>
@@ -30244,10 +30264,10 @@
       <w:color w:val="0f4761" w:themeColor="accent1" w:themeShade="BF"/>
     </w:rPr>
   </w:style>
-  <w:style w:type="character" w:styleId="168">
+  <w:style w:type="character" w:styleId="854">
     <w:name w:val="Intense Quote Char"/>
-    <w:basedOn w:val="148"/>
-    <w:link w:val="167"/>
+    <w:basedOn w:val="836"/>
+    <w:link w:val="853"/>
     <w:uiPriority w:val="30"/>
     <w:pPr>
       <w:pBdr/>
@@ -30260,9 +30280,9 @@
       <w:color w:val="0f4761" w:themeColor="accent1" w:themeShade="BF"/>
     </w:rPr>
   </w:style>
-  <w:style w:type="character" w:styleId="169">
+  <w:style w:type="character" w:styleId="855">
     <w:name w:val="Intense Reference"/>
-    <w:basedOn w:val="148"/>
+    <w:basedOn w:val="836"/>
     <w:uiPriority w:val="32"/>
     <w:qFormat/>
     <w:pPr>
@@ -30278,9 +30298,9 @@
       <w:spacing w:val="5"/>
     </w:rPr>
   </w:style>
-  <w:style w:type="character" w:styleId="171">
+  <w:style w:type="character" w:styleId="856">
     <w:name w:val="Subtle Emphasis"/>
-    <w:basedOn w:val="148"/>
+    <w:basedOn w:val="836"/>
     <w:uiPriority w:val="19"/>
     <w:qFormat/>
     <w:pPr>
@@ -30294,9 +30314,9 @@
       <w:color w:val="404040" w:themeColor="text1" w:themeTint="BF"/>
     </w:rPr>
   </w:style>
-  <w:style w:type="character" w:styleId="172">
+  <w:style w:type="character" w:styleId="857">
     <w:name w:val="Emphasis"/>
-    <w:basedOn w:val="148"/>
+    <w:basedOn w:val="836"/>
     <w:uiPriority w:val="20"/>
     <w:qFormat/>
     <w:pPr>
@@ -30309,9 +30329,9 @@
       <w:iCs/>
     </w:rPr>
   </w:style>
-  <w:style w:type="character" w:styleId="173">
+  <w:style w:type="character" w:styleId="858">
     <w:name w:val="Strong"/>
-    <w:basedOn w:val="148"/>
+    <w:basedOn w:val="836"/>
     <w:uiPriority w:val="22"/>
     <w:qFormat/>
     <w:pPr>
@@ -30324,9 +30344,9 @@
       <w:bCs/>
     </w:rPr>
   </w:style>
-  <w:style w:type="character" w:styleId="174">
+  <w:style w:type="character" w:styleId="859">
     <w:name w:val="Subtle Reference"/>
-    <w:basedOn w:val="148"/>
+    <w:basedOn w:val="836"/>
     <w:uiPriority w:val="31"/>
     <w:qFormat/>
     <w:pPr>
@@ -30339,9 +30359,9 @@
       <w:color w:val="5a5a5a" w:themeColor="text1" w:themeTint="A5"/>
     </w:rPr>
   </w:style>
-  <w:style w:type="character" w:styleId="175">
+  <w:style w:type="character" w:styleId="860">
     <w:name w:val="Book Title"/>
-    <w:basedOn w:val="148"/>
+    <w:basedOn w:val="836"/>
     <w:uiPriority w:val="33"/>
     <w:qFormat/>
     <w:pPr>
@@ -30357,10 +30377,10 @@
       <w:spacing w:val="5"/>
     </w:rPr>
   </w:style>
-  <w:style w:type="paragraph" w:styleId="176">
+  <w:style w:type="paragraph" w:styleId="861">
     <w:name w:val="Header"/>
-    <w:basedOn w:val="664"/>
-    <w:link w:val="177"/>
+    <w:basedOn w:val="886"/>
+    <w:link w:val="862"/>
     <w:uiPriority w:val="99"/>
     <w:unhideWhenUsed/>
     <w:pPr>
@@ -30373,10 +30393,10 @@
       <w:ind/>
     </w:pPr>
   </w:style>
-  <w:style w:type="character" w:styleId="177">
+  <w:style w:type="character" w:styleId="862">
     <w:name w:val="Header Char"/>
-    <w:basedOn w:val="148"/>
-    <w:link w:val="176"/>
+    <w:basedOn w:val="836"/>
+    <w:link w:val="861"/>
     <w:uiPriority w:val="99"/>
     <w:pPr>
       <w:pBdr/>
@@ -30384,10 +30404,10 @@
       <w:ind/>
     </w:pPr>
   </w:style>
-  <w:style w:type="paragraph" w:styleId="178">
+  <w:style w:type="paragraph" w:styleId="863">
     <w:name w:val="Footer"/>
-    <w:basedOn w:val="664"/>
-    <w:link w:val="179"/>
+    <w:basedOn w:val="886"/>
+    <w:link w:val="864"/>
     <w:uiPriority w:val="99"/>
     <w:unhideWhenUsed/>
     <w:pPr>
@@ -30400,10 +30420,10 @@
       <w:ind/>
     </w:pPr>
   </w:style>
-  <w:style w:type="character" w:styleId="179">
+  <w:style w:type="character" w:styleId="864">
     <w:name w:val="Footer Char"/>
-    <w:basedOn w:val="148"/>
-    <w:link w:val="178"/>
+    <w:basedOn w:val="836"/>
+    <w:link w:val="863"/>
     <w:uiPriority w:val="99"/>
     <w:pPr>
       <w:pBdr/>
@@ -30411,10 +30431,10 @@
       <w:ind/>
     </w:pPr>
   </w:style>
-  <w:style w:type="paragraph" w:styleId="180">
+  <w:style w:type="paragraph" w:styleId="865">
     <w:name w:val="Caption"/>
-    <w:basedOn w:val="664"/>
-    <w:next w:val="664"/>
+    <w:basedOn w:val="886"/>
+    <w:next w:val="886"/>
     <w:uiPriority w:val="35"/>
     <w:unhideWhenUsed/>
     <w:qFormat/>
@@ -30431,10 +30451,10 @@
       <w:szCs w:val="18"/>
     </w:rPr>
   </w:style>
-  <w:style w:type="paragraph" w:styleId="181">
+  <w:style w:type="paragraph" w:styleId="866">
     <w:name w:val="footnote text"/>
-    <w:basedOn w:val="664"/>
-    <w:link w:val="182"/>
+    <w:basedOn w:val="886"/>
+    <w:link w:val="867"/>
     <w:uiPriority w:val="99"/>
     <w:semiHidden/>
     <w:unhideWhenUsed/>
@@ -30448,10 +30468,10 @@
       <w:szCs w:val="20"/>
     </w:rPr>
   </w:style>
-  <w:style w:type="character" w:styleId="182">
+  <w:style w:type="character" w:styleId="867">
     <w:name w:val="Footnote Text Char"/>
-    <w:basedOn w:val="148"/>
-    <w:link w:val="181"/>
+    <w:basedOn w:val="836"/>
+    <w:link w:val="866"/>
     <w:uiPriority w:val="99"/>
     <w:semiHidden/>
     <w:pPr>
@@ -30464,9 +30484,9 @@
       <w:szCs w:val="20"/>
     </w:rPr>
   </w:style>
-  <w:style w:type="character" w:styleId="183">
+  <w:style w:type="character" w:styleId="868">
     <w:name w:val="footnote reference"/>
-    <w:basedOn w:val="148"/>
+    <w:basedOn w:val="836"/>
     <w:uiPriority w:val="99"/>
     <w:semiHidden/>
     <w:unhideWhenUsed/>
@@ -30479,10 +30499,10 @@
       <w:vertAlign w:val="superscript"/>
     </w:rPr>
   </w:style>
-  <w:style w:type="paragraph" w:styleId="184">
+  <w:style w:type="paragraph" w:styleId="869">
     <w:name w:val="endnote text"/>
-    <w:basedOn w:val="664"/>
-    <w:link w:val="185"/>
+    <w:basedOn w:val="886"/>
+    <w:link w:val="870"/>
     <w:uiPriority w:val="99"/>
     <w:semiHidden/>
     <w:unhideWhenUsed/>
@@ -30496,10 +30516,10 @@
       <w:szCs w:val="20"/>
     </w:rPr>
   </w:style>
-  <w:style w:type="character" w:styleId="185">
+  <w:style w:type="character" w:styleId="870">
     <w:name w:val="Endnote Text Char"/>
-    <w:basedOn w:val="148"/>
-    <w:link w:val="184"/>
+    <w:basedOn w:val="836"/>
+    <w:link w:val="869"/>
     <w:uiPriority w:val="99"/>
     <w:semiHidden/>
     <w:pPr>
@@ -30512,9 +30532,9 @@
       <w:szCs w:val="20"/>
     </w:rPr>
   </w:style>
-  <w:style w:type="character" w:styleId="186">
+  <w:style w:type="character" w:styleId="871">
     <w:name w:val="endnote reference"/>
-    <w:basedOn w:val="148"/>
+    <w:basedOn w:val="836"/>
     <w:uiPriority w:val="99"/>
     <w:semiHidden/>
     <w:unhideWhenUsed/>
@@ -30527,9 +30547,9 @@
       <w:vertAlign w:val="superscript"/>
     </w:rPr>
   </w:style>
-  <w:style w:type="character" w:styleId="187">
+  <w:style w:type="character" w:styleId="872">
     <w:name w:val="Hyperlink"/>
-    <w:basedOn w:val="148"/>
+    <w:basedOn w:val="836"/>
     <w:uiPriority w:val="99"/>
     <w:unhideWhenUsed/>
     <w:pPr>
@@ -30542,9 +30562,9 @@
       <w:u w:val="single"/>
     </w:rPr>
   </w:style>
-  <w:style w:type="character" w:styleId="188">
+  <w:style w:type="character" w:styleId="873">
     <w:name w:val="FollowedHyperlink"/>
-    <w:basedOn w:val="148"/>
+    <w:basedOn w:val="836"/>
     <w:uiPriority w:val="99"/>
     <w:semiHidden/>
     <w:unhideWhenUsed/>
@@ -30558,10 +30578,10 @@
       <w:u w:val="single"/>
     </w:rPr>
   </w:style>
-  <w:style w:type="paragraph" w:styleId="189">
+  <w:style w:type="paragraph" w:styleId="874">
     <w:name w:val="toc 1"/>
-    <w:basedOn w:val="664"/>
-    <w:next w:val="664"/>
+    <w:basedOn w:val="886"/>
+    <w:next w:val="886"/>
     <w:uiPriority w:val="39"/>
     <w:unhideWhenUsed/>
     <w:pPr>
@@ -30570,10 +30590,10 @@
       <w:ind/>
     </w:pPr>
   </w:style>
-  <w:style w:type="paragraph" w:styleId="190">
+  <w:style w:type="paragraph" w:styleId="875">
     <w:name w:val="toc 2"/>
-    <w:basedOn w:val="664"/>
-    <w:next w:val="664"/>
+    <w:basedOn w:val="886"/>
+    <w:next w:val="886"/>
     <w:uiPriority w:val="39"/>
     <w:unhideWhenUsed/>
     <w:pPr>
@@ -30582,10 +30602,10 @@
       <w:ind w:left="220"/>
     </w:pPr>
   </w:style>
-  <w:style w:type="paragraph" w:styleId="191">
+  <w:style w:type="paragraph" w:styleId="876">
     <w:name w:val="toc 3"/>
-    <w:basedOn w:val="664"/>
-    <w:next w:val="664"/>
+    <w:basedOn w:val="886"/>
+    <w:next w:val="886"/>
     <w:uiPriority w:val="39"/>
     <w:unhideWhenUsed/>
     <w:pPr>
@@ -30594,10 +30614,10 @@
       <w:ind w:left="440"/>
     </w:pPr>
   </w:style>
-  <w:style w:type="paragraph" w:styleId="192">
+  <w:style w:type="paragraph" w:styleId="877">
     <w:name w:val="toc 4"/>
-    <w:basedOn w:val="664"/>
-    <w:next w:val="664"/>
+    <w:basedOn w:val="886"/>
+    <w:next w:val="886"/>
     <w:uiPriority w:val="39"/>
     <w:unhideWhenUsed/>
     <w:pPr>
@@ -30606,10 +30626,10 @@
       <w:ind w:left="660"/>
     </w:pPr>
   </w:style>
-  <w:style w:type="paragraph" w:styleId="193">
+  <w:style w:type="paragraph" w:styleId="878">
     <w:name w:val="toc 5"/>
-    <w:basedOn w:val="664"/>
-    <w:next w:val="664"/>
+    <w:basedOn w:val="886"/>
+    <w:next w:val="886"/>
     <w:uiPriority w:val="39"/>
     <w:unhideWhenUsed/>
     <w:pPr>
@@ -30618,10 +30638,10 @@
       <w:ind w:left="880"/>
     </w:pPr>
   </w:style>
-  <w:style w:type="paragraph" w:styleId="194">
+  <w:style w:type="paragraph" w:styleId="879">
     <w:name w:val="toc 6"/>
-    <w:basedOn w:val="664"/>
-    <w:next w:val="664"/>
+    <w:basedOn w:val="886"/>
+    <w:next w:val="886"/>
     <w:uiPriority w:val="39"/>
     <w:unhideWhenUsed/>
     <w:pPr>
@@ -30630,10 +30650,10 @@
       <w:ind w:left="1100"/>
     </w:pPr>
   </w:style>
-  <w:style w:type="paragraph" w:styleId="195">
+  <w:style w:type="paragraph" w:styleId="880">
     <w:name w:val="toc 7"/>
-    <w:basedOn w:val="664"/>
-    <w:next w:val="664"/>
+    <w:basedOn w:val="886"/>
+    <w:next w:val="886"/>
     <w:uiPriority w:val="39"/>
     <w:unhideWhenUsed/>
     <w:pPr>
@@ -30642,10 +30662,10 @@
       <w:ind w:left="1320"/>
     </w:pPr>
   </w:style>
-  <w:style w:type="paragraph" w:styleId="196">
+  <w:style w:type="paragraph" w:styleId="881">
     <w:name w:val="toc 8"/>
-    <w:basedOn w:val="664"/>
-    <w:next w:val="664"/>
+    <w:basedOn w:val="886"/>
+    <w:next w:val="886"/>
     <w:uiPriority w:val="39"/>
     <w:unhideWhenUsed/>
     <w:pPr>
@@ -30654,10 +30674,10 @@
       <w:ind w:left="1540"/>
     </w:pPr>
   </w:style>
-  <w:style w:type="paragraph" w:styleId="197">
+  <w:style w:type="paragraph" w:styleId="882">
     <w:name w:val="toc 9"/>
-    <w:basedOn w:val="664"/>
-    <w:next w:val="664"/>
+    <w:basedOn w:val="886"/>
+    <w:next w:val="886"/>
     <w:uiPriority w:val="39"/>
     <w:unhideWhenUsed/>
     <w:pPr>
@@ -30666,9 +30686,9 @@
       <w:ind w:left="1760"/>
     </w:pPr>
   </w:style>
-  <w:style w:type="character" w:styleId="198">
+  <w:style w:type="character" w:styleId="883">
     <w:name w:val="Placeholder Text"/>
-    <w:basedOn w:val="148"/>
+    <w:basedOn w:val="836"/>
     <w:uiPriority w:val="99"/>
     <w:semiHidden/>
     <w:pPr>
@@ -30680,7 +30700,7 @@
       <w:color w:val="666666"/>
     </w:rPr>
   </w:style>
-  <w:style w:type="paragraph" w:styleId="208">
+  <w:style w:type="paragraph" w:styleId="884">
     <w:name w:val="TOC Heading"/>
     <w:uiPriority w:val="39"/>
     <w:unhideWhenUsed/>
@@ -30690,10 +30710,10 @@
       <w:ind/>
     </w:pPr>
   </w:style>
-  <w:style w:type="paragraph" w:styleId="209">
+  <w:style w:type="paragraph" w:styleId="885">
     <w:name w:val="table of figures"/>
-    <w:basedOn w:val="664"/>
-    <w:next w:val="664"/>
+    <w:basedOn w:val="886"/>
+    <w:next w:val="886"/>
     <w:uiPriority w:val="99"/>
     <w:unhideWhenUsed/>
     <w:pPr>
@@ -30702,7 +30722,7 @@
       <w:ind/>
     </w:pPr>
   </w:style>
-  <w:style w:type="paragraph" w:styleId="664" w:default="1">
+  <w:style w:type="paragraph" w:styleId="886" w:default="1">
     <w:name w:val="Normal"/>
     <w:qFormat/>
     <w:pPr>
@@ -30711,7 +30731,7 @@
       <w:ind/>
     </w:pPr>
   </w:style>
-  <w:style w:type="table" w:styleId="665" w:default="1">
+  <w:style w:type="table" w:styleId="887" w:default="1">
     <w:name w:val="Normal Table"/>
     <w:uiPriority w:val="99"/>
     <w:semiHidden/>
@@ -30904,7 +30924,7 @@
       </w:tcPr>
     </w:tblStylePr>
   </w:style>
-  <w:style w:type="numbering" w:styleId="666" w:default="1">
+  <w:style w:type="numbering" w:styleId="888" w:default="1">
     <w:name w:val="No List"/>
     <w:uiPriority w:val="99"/>
     <w:semiHidden/>
@@ -30915,9 +30935,9 @@
       <w:ind/>
     </w:pPr>
   </w:style>
-  <w:style w:type="paragraph" w:styleId="667">
+  <w:style w:type="paragraph" w:styleId="889">
     <w:name w:val="No Spacing"/>
-    <w:basedOn w:val="664"/>
+    <w:basedOn w:val="886"/>
     <w:uiPriority w:val="1"/>
     <w:qFormat/>
     <w:pPr>
@@ -30926,9 +30946,9 @@
       <w:ind/>
     </w:pPr>
   </w:style>
-  <w:style w:type="paragraph" w:styleId="668">
+  <w:style w:type="paragraph" w:styleId="890">
     <w:name w:val="List Paragraph"/>
-    <w:basedOn w:val="664"/>
+    <w:basedOn w:val="886"/>
     <w:uiPriority w:val="34"/>
     <w:qFormat/>
     <w:pPr>

</xml_diff>